<commit_message>
Redesign Pyret tab with 7-step flow, LCD simulation, and mini graph
</commit_message>
<xml_diff>
--- a/src/lessons/lessons/L0_Classroom_Action_Lesson_Plan.docx
+++ b/src/lessons/lessons/L0_Classroom_Action_Lesson_Plan.docx
@@ -7,18 +7,16 @@
         <w:spacing w:after="160"/>
         <w:jc w:val="center"/>
         <w:rPr>
-          <w:rFonts w:asciiTheme="minorHAnsi" w:hAnsiTheme="minorHAnsi" w:cstheme="minorHAnsi"/>
-          <w:sz w:val="24"/>
-          <w:szCs w:val="24"/>
-        </w:rPr>
-      </w:pPr>
-      <w:r>
-        <w:rPr>
-          <w:rFonts w:asciiTheme="minorHAnsi" w:hAnsiTheme="minorHAnsi" w:cstheme="minorHAnsi"/>
+          <w:sz w:val="20"/>
+          <w:szCs w:val="20"/>
+        </w:rPr>
+      </w:pPr>
+      <w:r>
+        <w:rPr>
           <w:b/>
           <w:bCs/>
-          <w:sz w:val="24"/>
-          <w:szCs w:val="24"/>
+          <w:sz w:val="20"/>
+          <w:szCs w:val="20"/>
         </w:rPr>
         <w:t>Classroom Action Lesson Plan</w:t>
       </w:r>
@@ -28,18 +26,16 @@
         <w:spacing w:after="80"/>
         <w:jc w:val="center"/>
         <w:rPr>
-          <w:rFonts w:asciiTheme="minorHAnsi" w:hAnsiTheme="minorHAnsi" w:cstheme="minorHAnsi"/>
-          <w:sz w:val="24"/>
-          <w:szCs w:val="24"/>
-        </w:rPr>
-      </w:pPr>
-      <w:r>
-        <w:rPr>
-          <w:rFonts w:asciiTheme="minorHAnsi" w:hAnsiTheme="minorHAnsi" w:cstheme="minorHAnsi"/>
+          <w:sz w:val="20"/>
+          <w:szCs w:val="20"/>
+        </w:rPr>
+      </w:pPr>
+      <w:r>
+        <w:rPr>
           <w:b/>
           <w:bCs/>
-          <w:sz w:val="24"/>
-          <w:szCs w:val="24"/>
+          <w:sz w:val="20"/>
+          <w:szCs w:val="20"/>
         </w:rPr>
         <w:t>Algebra IDE — Lesson L0: Ages</w:t>
       </w:r>
@@ -49,38 +45,52 @@
         <w:spacing w:after="400"/>
         <w:jc w:val="center"/>
         <w:rPr>
-          <w:rFonts w:asciiTheme="minorHAnsi" w:hAnsiTheme="minorHAnsi" w:cstheme="minorHAnsi"/>
-          <w:sz w:val="24"/>
-          <w:szCs w:val="24"/>
-        </w:rPr>
-      </w:pPr>
-      <w:r>
-        <w:rPr>
-          <w:rFonts w:asciiTheme="minorHAnsi" w:hAnsiTheme="minorHAnsi" w:cstheme="minorHAnsi"/>
+          <w:sz w:val="20"/>
+          <w:szCs w:val="20"/>
+        </w:rPr>
+      </w:pPr>
+      <w:r>
+        <w:rPr>
           <w:i/>
           <w:iCs/>
-          <w:sz w:val="24"/>
-          <w:szCs w:val="24"/>
-        </w:rPr>
-        <w:t>A practical guide for classroom implementation</w:t>
+          <w:sz w:val="20"/>
+          <w:szCs w:val="20"/>
+        </w:rPr>
+        <w:t xml:space="preserve">A practical </w:t>
+      </w:r>
+      <w:r>
+        <w:rPr>
+          <w:i/>
+          <w:iCs/>
+          <w:sz w:val="20"/>
+          <w:szCs w:val="20"/>
+        </w:rPr>
+        <w:t xml:space="preserve">teacher </w:t>
+      </w:r>
+      <w:r>
+        <w:rPr>
+          <w:i/>
+          <w:iCs/>
+          <w:sz w:val="20"/>
+          <w:szCs w:val="20"/>
+        </w:rPr>
+        <w:t>guide for classroom implementation</w:t>
       </w:r>
     </w:p>
     <w:p>
       <w:pPr>
         <w:pStyle w:val="Heading1"/>
         <w:rPr>
-          <w:rFonts w:asciiTheme="minorHAnsi" w:hAnsiTheme="minorHAnsi" w:cstheme="minorHAnsi"/>
           <w:color w:val="auto"/>
-          <w:sz w:val="24"/>
-          <w:szCs w:val="24"/>
-        </w:rPr>
-      </w:pPr>
-      <w:r>
-        <w:rPr>
-          <w:rFonts w:asciiTheme="minorHAnsi" w:hAnsiTheme="minorHAnsi" w:cstheme="minorHAnsi"/>
+          <w:sz w:val="20"/>
+          <w:szCs w:val="20"/>
+        </w:rPr>
+      </w:pPr>
+      <w:r>
+        <w:rPr>
           <w:color w:val="auto"/>
-          <w:sz w:val="24"/>
-          <w:szCs w:val="24"/>
+          <w:sz w:val="20"/>
+          <w:szCs w:val="20"/>
         </w:rPr>
         <w:t>Lesson Overview</w:t>
       </w:r>
@@ -88,9 +98,8 @@
     <w:p>
       <w:pPr>
         <w:rPr>
-          <w:rFonts w:asciiTheme="minorHAnsi" w:hAnsiTheme="minorHAnsi" w:cstheme="minorHAnsi"/>
-          <w:sz w:val="24"/>
-          <w:szCs w:val="24"/>
+          <w:sz w:val="20"/>
+          <w:szCs w:val="20"/>
         </w:rPr>
       </w:pPr>
     </w:p>
@@ -116,12 +125,6 @@
         <w:gridCol w:w="6560"/>
       </w:tblGrid>
       <w:tr>
-        <w:tblPrEx>
-          <w:tblCellMar>
-            <w:top w:w="0" w:type="dxa"/>
-            <w:bottom w:w="0" w:type="dxa"/>
-          </w:tblCellMar>
-        </w:tblPrEx>
         <w:tc>
           <w:tcPr>
             <w:tcW w:w="2800" w:type="dxa"/>
@@ -142,18 +145,16 @@
           <w:p>
             <w:pPr>
               <w:rPr>
-                <w:rFonts w:asciiTheme="minorHAnsi" w:hAnsiTheme="minorHAnsi" w:cstheme="minorHAnsi"/>
-                <w:sz w:val="24"/>
-                <w:szCs w:val="24"/>
-              </w:rPr>
-            </w:pPr>
-            <w:r>
-              <w:rPr>
-                <w:rFonts w:asciiTheme="minorHAnsi" w:hAnsiTheme="minorHAnsi" w:cstheme="minorHAnsi"/>
+                <w:sz w:val="20"/>
+                <w:szCs w:val="20"/>
+              </w:rPr>
+            </w:pPr>
+            <w:r>
+              <w:rPr>
                 <w:b/>
                 <w:bCs/>
-                <w:sz w:val="24"/>
-                <w:szCs w:val="24"/>
+                <w:sz w:val="20"/>
+                <w:szCs w:val="20"/>
               </w:rPr>
               <w:t>Subject</w:t>
             </w:r>
@@ -178,16 +179,14 @@
           <w:p>
             <w:pPr>
               <w:rPr>
-                <w:rFonts w:asciiTheme="minorHAnsi" w:hAnsiTheme="minorHAnsi" w:cstheme="minorHAnsi"/>
-                <w:sz w:val="24"/>
-                <w:szCs w:val="24"/>
-              </w:rPr>
-            </w:pPr>
-            <w:r>
-              <w:rPr>
-                <w:rFonts w:asciiTheme="minorHAnsi" w:hAnsiTheme="minorHAnsi" w:cstheme="minorHAnsi"/>
-                <w:sz w:val="24"/>
-                <w:szCs w:val="24"/>
+                <w:sz w:val="20"/>
+                <w:szCs w:val="20"/>
+              </w:rPr>
+            </w:pPr>
+            <w:r>
+              <w:rPr>
+                <w:sz w:val="20"/>
+                <w:szCs w:val="20"/>
               </w:rPr>
               <w:t>Mathematics — Algebra</w:t>
             </w:r>
@@ -195,12 +194,6 @@
         </w:tc>
       </w:tr>
       <w:tr>
-        <w:tblPrEx>
-          <w:tblCellMar>
-            <w:top w:w="0" w:type="dxa"/>
-            <w:bottom w:w="0" w:type="dxa"/>
-          </w:tblCellMar>
-        </w:tblPrEx>
         <w:tc>
           <w:tcPr>
             <w:tcW w:w="2800" w:type="dxa"/>
@@ -221,18 +214,16 @@
           <w:p>
             <w:pPr>
               <w:rPr>
-                <w:rFonts w:asciiTheme="minorHAnsi" w:hAnsiTheme="minorHAnsi" w:cstheme="minorHAnsi"/>
-                <w:sz w:val="24"/>
-                <w:szCs w:val="24"/>
-              </w:rPr>
-            </w:pPr>
-            <w:r>
-              <w:rPr>
-                <w:rFonts w:asciiTheme="minorHAnsi" w:hAnsiTheme="minorHAnsi" w:cstheme="minorHAnsi"/>
+                <w:sz w:val="20"/>
+                <w:szCs w:val="20"/>
+              </w:rPr>
+            </w:pPr>
+            <w:r>
+              <w:rPr>
                 <w:b/>
                 <w:bCs/>
-                <w:sz w:val="24"/>
-                <w:szCs w:val="24"/>
+                <w:sz w:val="20"/>
+                <w:szCs w:val="20"/>
               </w:rPr>
               <w:t>Grade Level</w:t>
             </w:r>
@@ -257,16 +248,14 @@
           <w:p>
             <w:pPr>
               <w:rPr>
-                <w:rFonts w:asciiTheme="minorHAnsi" w:hAnsiTheme="minorHAnsi" w:cstheme="minorHAnsi"/>
-                <w:sz w:val="24"/>
-                <w:szCs w:val="24"/>
-              </w:rPr>
-            </w:pPr>
-            <w:r>
-              <w:rPr>
-                <w:rFonts w:asciiTheme="minorHAnsi" w:hAnsiTheme="minorHAnsi" w:cstheme="minorHAnsi"/>
-                <w:sz w:val="24"/>
-                <w:szCs w:val="24"/>
+                <w:sz w:val="20"/>
+                <w:szCs w:val="20"/>
+              </w:rPr>
+            </w:pPr>
+            <w:r>
+              <w:rPr>
+                <w:sz w:val="20"/>
+                <w:szCs w:val="20"/>
               </w:rPr>
               <w:t>Middle School (Grades 6–8)</w:t>
             </w:r>
@@ -274,12 +263,6 @@
         </w:tc>
       </w:tr>
       <w:tr>
-        <w:tblPrEx>
-          <w:tblCellMar>
-            <w:top w:w="0" w:type="dxa"/>
-            <w:bottom w:w="0" w:type="dxa"/>
-          </w:tblCellMar>
-        </w:tblPrEx>
         <w:tc>
           <w:tcPr>
             <w:tcW w:w="2800" w:type="dxa"/>
@@ -300,18 +283,16 @@
           <w:p>
             <w:pPr>
               <w:rPr>
-                <w:rFonts w:asciiTheme="minorHAnsi" w:hAnsiTheme="minorHAnsi" w:cstheme="minorHAnsi"/>
-                <w:sz w:val="24"/>
-                <w:szCs w:val="24"/>
-              </w:rPr>
-            </w:pPr>
-            <w:r>
-              <w:rPr>
-                <w:rFonts w:asciiTheme="minorHAnsi" w:hAnsiTheme="minorHAnsi" w:cstheme="minorHAnsi"/>
+                <w:sz w:val="20"/>
+                <w:szCs w:val="20"/>
+              </w:rPr>
+            </w:pPr>
+            <w:r>
+              <w:rPr>
                 <w:b/>
                 <w:bCs/>
-                <w:sz w:val="24"/>
-                <w:szCs w:val="24"/>
+                <w:sz w:val="20"/>
+                <w:szCs w:val="20"/>
               </w:rPr>
               <w:t>Duration</w:t>
             </w:r>
@@ -336,16 +317,14 @@
           <w:p>
             <w:pPr>
               <w:rPr>
-                <w:rFonts w:asciiTheme="minorHAnsi" w:hAnsiTheme="minorHAnsi" w:cstheme="minorHAnsi"/>
-                <w:sz w:val="24"/>
-                <w:szCs w:val="24"/>
-              </w:rPr>
-            </w:pPr>
-            <w:r>
-              <w:rPr>
-                <w:rFonts w:asciiTheme="minorHAnsi" w:hAnsiTheme="minorHAnsi" w:cstheme="minorHAnsi"/>
-                <w:sz w:val="24"/>
-                <w:szCs w:val="24"/>
+                <w:sz w:val="20"/>
+                <w:szCs w:val="20"/>
+              </w:rPr>
+            </w:pPr>
+            <w:r>
+              <w:rPr>
+                <w:sz w:val="20"/>
+                <w:szCs w:val="20"/>
               </w:rPr>
               <w:t>60–75 minutes</w:t>
             </w:r>
@@ -353,12 +332,6 @@
         </w:tc>
       </w:tr>
       <w:tr>
-        <w:tblPrEx>
-          <w:tblCellMar>
-            <w:top w:w="0" w:type="dxa"/>
-            <w:bottom w:w="0" w:type="dxa"/>
-          </w:tblCellMar>
-        </w:tblPrEx>
         <w:tc>
           <w:tcPr>
             <w:tcW w:w="2800" w:type="dxa"/>
@@ -379,18 +352,16 @@
           <w:p>
             <w:pPr>
               <w:rPr>
-                <w:rFonts w:asciiTheme="minorHAnsi" w:hAnsiTheme="minorHAnsi" w:cstheme="minorHAnsi"/>
-                <w:sz w:val="24"/>
-                <w:szCs w:val="24"/>
-              </w:rPr>
-            </w:pPr>
-            <w:r>
-              <w:rPr>
-                <w:rFonts w:asciiTheme="minorHAnsi" w:hAnsiTheme="minorHAnsi" w:cstheme="minorHAnsi"/>
+                <w:sz w:val="20"/>
+                <w:szCs w:val="20"/>
+              </w:rPr>
+            </w:pPr>
+            <w:r>
+              <w:rPr>
                 <w:b/>
                 <w:bCs/>
-                <w:sz w:val="24"/>
-                <w:szCs w:val="24"/>
+                <w:sz w:val="20"/>
+                <w:szCs w:val="20"/>
               </w:rPr>
               <w:t>Tools</w:t>
             </w:r>
@@ -415,47 +386,21 @@
           <w:p>
             <w:pPr>
               <w:rPr>
-                <w:rFonts w:asciiTheme="minorHAnsi" w:hAnsiTheme="minorHAnsi" w:cstheme="minorHAnsi"/>
-                <w:sz w:val="24"/>
-                <w:szCs w:val="24"/>
-              </w:rPr>
-            </w:pPr>
-            <w:r>
-              <w:rPr>
-                <w:rFonts w:asciiTheme="minorHAnsi" w:hAnsiTheme="minorHAnsi" w:cstheme="minorHAnsi"/>
-                <w:sz w:val="24"/>
-                <w:szCs w:val="24"/>
-              </w:rPr>
-              <w:t xml:space="preserve">Algebra IDE — Task, Desmos, </w:t>
-            </w:r>
-            <w:proofErr w:type="spellStart"/>
-            <w:r>
-              <w:rPr>
-                <w:rFonts w:asciiTheme="minorHAnsi" w:hAnsiTheme="minorHAnsi" w:cstheme="minorHAnsi"/>
-                <w:sz w:val="24"/>
-                <w:szCs w:val="24"/>
-              </w:rPr>
-              <w:t>Pyret</w:t>
-            </w:r>
-            <w:proofErr w:type="spellEnd"/>
-            <w:r>
-              <w:rPr>
-                <w:rFonts w:asciiTheme="minorHAnsi" w:hAnsiTheme="minorHAnsi" w:cstheme="minorHAnsi"/>
-                <w:sz w:val="24"/>
-                <w:szCs w:val="24"/>
-              </w:rPr>
-              <w:t>, Check tabs</w:t>
+                <w:sz w:val="20"/>
+                <w:szCs w:val="20"/>
+              </w:rPr>
+            </w:pPr>
+            <w:r>
+              <w:rPr>
+                <w:sz w:val="20"/>
+                <w:szCs w:val="20"/>
+              </w:rPr>
+              <w:t>Algebra IDE — Task, Desmos, Pyret, Check tabs</w:t>
             </w:r>
           </w:p>
         </w:tc>
       </w:tr>
       <w:tr>
-        <w:tblPrEx>
-          <w:tblCellMar>
-            <w:top w:w="0" w:type="dxa"/>
-            <w:bottom w:w="0" w:type="dxa"/>
-          </w:tblCellMar>
-        </w:tblPrEx>
         <w:tc>
           <w:tcPr>
             <w:tcW w:w="2800" w:type="dxa"/>
@@ -476,18 +421,16 @@
           <w:p>
             <w:pPr>
               <w:rPr>
-                <w:rFonts w:asciiTheme="minorHAnsi" w:hAnsiTheme="minorHAnsi" w:cstheme="minorHAnsi"/>
-                <w:sz w:val="24"/>
-                <w:szCs w:val="24"/>
-              </w:rPr>
-            </w:pPr>
-            <w:r>
-              <w:rPr>
-                <w:rFonts w:asciiTheme="minorHAnsi" w:hAnsiTheme="minorHAnsi" w:cstheme="minorHAnsi"/>
+                <w:sz w:val="20"/>
+                <w:szCs w:val="20"/>
+              </w:rPr>
+            </w:pPr>
+            <w:r>
+              <w:rPr>
                 <w:b/>
                 <w:bCs/>
-                <w:sz w:val="24"/>
-                <w:szCs w:val="24"/>
+                <w:sz w:val="20"/>
+                <w:szCs w:val="20"/>
               </w:rPr>
               <w:t>The Problem</w:t>
             </w:r>
@@ -512,16 +455,14 @@
           <w:p>
             <w:pPr>
               <w:rPr>
-                <w:rFonts w:asciiTheme="minorHAnsi" w:hAnsiTheme="minorHAnsi" w:cstheme="minorHAnsi"/>
-                <w:sz w:val="24"/>
-                <w:szCs w:val="24"/>
-              </w:rPr>
-            </w:pPr>
-            <w:r>
-              <w:rPr>
-                <w:rFonts w:asciiTheme="minorHAnsi" w:hAnsiTheme="minorHAnsi" w:cstheme="minorHAnsi"/>
-                <w:sz w:val="24"/>
-                <w:szCs w:val="24"/>
+                <w:sz w:val="20"/>
+                <w:szCs w:val="20"/>
+              </w:rPr>
+            </w:pPr>
+            <w:r>
+              <w:rPr>
+                <w:sz w:val="20"/>
+                <w:szCs w:val="20"/>
               </w:rPr>
               <w:t>Selvi and Thamarai are siblings. Thamarai is 4 years older than Selvi. If Selvi is x years old, how old is Thamarai?</w:t>
             </w:r>
@@ -529,12 +470,6 @@
         </w:tc>
       </w:tr>
       <w:tr>
-        <w:tblPrEx>
-          <w:tblCellMar>
-            <w:top w:w="0" w:type="dxa"/>
-            <w:bottom w:w="0" w:type="dxa"/>
-          </w:tblCellMar>
-        </w:tblPrEx>
         <w:tc>
           <w:tcPr>
             <w:tcW w:w="2800" w:type="dxa"/>
@@ -555,18 +490,16 @@
           <w:p>
             <w:pPr>
               <w:rPr>
-                <w:rFonts w:asciiTheme="minorHAnsi" w:hAnsiTheme="minorHAnsi" w:cstheme="minorHAnsi"/>
-                <w:sz w:val="24"/>
-                <w:szCs w:val="24"/>
-              </w:rPr>
-            </w:pPr>
-            <w:r>
-              <w:rPr>
-                <w:rFonts w:asciiTheme="minorHAnsi" w:hAnsiTheme="minorHAnsi" w:cstheme="minorHAnsi"/>
+                <w:sz w:val="20"/>
+                <w:szCs w:val="20"/>
+              </w:rPr>
+            </w:pPr>
+            <w:r>
+              <w:rPr>
                 <w:b/>
                 <w:bCs/>
-                <w:sz w:val="24"/>
-                <w:szCs w:val="24"/>
+                <w:sz w:val="20"/>
+                <w:szCs w:val="20"/>
               </w:rPr>
               <w:t>Core Equation</w:t>
             </w:r>
@@ -591,16 +524,14 @@
           <w:p>
             <w:pPr>
               <w:rPr>
-                <w:rFonts w:asciiTheme="minorHAnsi" w:hAnsiTheme="minorHAnsi" w:cstheme="minorHAnsi"/>
-                <w:sz w:val="24"/>
-                <w:szCs w:val="24"/>
-              </w:rPr>
-            </w:pPr>
-            <w:r>
-              <w:rPr>
-                <w:rFonts w:asciiTheme="minorHAnsi" w:hAnsiTheme="minorHAnsi" w:cstheme="minorHAnsi"/>
-                <w:sz w:val="24"/>
-                <w:szCs w:val="24"/>
+                <w:sz w:val="20"/>
+                <w:szCs w:val="20"/>
+              </w:rPr>
+            </w:pPr>
+            <w:r>
+              <w:rPr>
+                <w:sz w:val="20"/>
+                <w:szCs w:val="20"/>
               </w:rPr>
               <w:t>y = x + 4</w:t>
             </w:r>
@@ -611,9 +542,8 @@
     <w:p>
       <w:pPr>
         <w:rPr>
-          <w:rFonts w:asciiTheme="minorHAnsi" w:hAnsiTheme="minorHAnsi" w:cstheme="minorHAnsi"/>
-          <w:sz w:val="24"/>
-          <w:szCs w:val="24"/>
+          <w:sz w:val="20"/>
+          <w:szCs w:val="20"/>
         </w:rPr>
       </w:pPr>
     </w:p>
@@ -621,76 +551,52 @@
       <w:pPr>
         <w:pStyle w:val="Heading1"/>
         <w:rPr>
-          <w:rFonts w:asciiTheme="minorHAnsi" w:hAnsiTheme="minorHAnsi" w:cstheme="minorHAnsi"/>
           <w:color w:val="auto"/>
-          <w:sz w:val="24"/>
-          <w:szCs w:val="24"/>
-        </w:rPr>
-      </w:pPr>
-      <w:r>
-        <w:rPr>
-          <w:rFonts w:asciiTheme="minorHAnsi" w:hAnsiTheme="minorHAnsi" w:cstheme="minorHAnsi"/>
+          <w:sz w:val="20"/>
+          <w:szCs w:val="20"/>
+        </w:rPr>
+      </w:pPr>
+      <w:r>
+        <w:rPr>
           <w:color w:val="auto"/>
-          <w:sz w:val="24"/>
-          <w:szCs w:val="24"/>
+          <w:sz w:val="20"/>
+          <w:szCs w:val="20"/>
         </w:rPr>
         <w:t>Learning Objectives</w:t>
       </w:r>
     </w:p>
     <w:p>
       <w:pPr>
-        <w:rPr>
-          <w:rFonts w:asciiTheme="minorHAnsi" w:hAnsiTheme="minorHAnsi" w:cstheme="minorHAnsi"/>
-          <w:sz w:val="24"/>
-          <w:szCs w:val="24"/>
-        </w:rPr>
-      </w:pPr>
-    </w:p>
-    <w:p>
-      <w:pPr>
         <w:spacing w:before="80" w:after="80"/>
         <w:rPr>
-          <w:rFonts w:asciiTheme="minorHAnsi" w:hAnsiTheme="minorHAnsi" w:cstheme="minorHAnsi"/>
-          <w:sz w:val="24"/>
-          <w:szCs w:val="24"/>
-        </w:rPr>
-      </w:pPr>
-      <w:r>
-        <w:rPr>
-          <w:rFonts w:asciiTheme="minorHAnsi" w:hAnsiTheme="minorHAnsi" w:cstheme="minorHAnsi"/>
+          <w:sz w:val="20"/>
+          <w:szCs w:val="20"/>
+        </w:rPr>
+      </w:pPr>
+      <w:r>
+        <w:rPr>
           <w:b/>
           <w:bCs/>
-          <w:sz w:val="24"/>
-          <w:szCs w:val="24"/>
+          <w:sz w:val="20"/>
+          <w:szCs w:val="20"/>
         </w:rPr>
         <w:t>By the end of this lesson, students will be able to:</w:t>
       </w:r>
     </w:p>
     <w:p>
       <w:pPr>
-        <w:rPr>
-          <w:rFonts w:asciiTheme="minorHAnsi" w:hAnsiTheme="minorHAnsi" w:cstheme="minorHAnsi"/>
-          <w:sz w:val="24"/>
-          <w:szCs w:val="24"/>
-        </w:rPr>
-      </w:pPr>
-    </w:p>
-    <w:p>
-      <w:pPr>
         <w:spacing w:before="80" w:after="80"/>
         <w:rPr>
-          <w:rFonts w:asciiTheme="minorHAnsi" w:hAnsiTheme="minorHAnsi" w:cstheme="minorHAnsi"/>
-          <w:sz w:val="24"/>
-          <w:szCs w:val="24"/>
-        </w:rPr>
-      </w:pPr>
-      <w:r>
-        <w:rPr>
-          <w:rFonts w:asciiTheme="minorHAnsi" w:hAnsiTheme="minorHAnsi" w:cstheme="minorHAnsi"/>
+          <w:sz w:val="20"/>
+          <w:szCs w:val="20"/>
+        </w:rPr>
+      </w:pPr>
+      <w:r>
+        <w:rPr>
           <w:b/>
           <w:bCs/>
-          <w:sz w:val="24"/>
-          <w:szCs w:val="24"/>
+          <w:sz w:val="20"/>
+          <w:szCs w:val="20"/>
         </w:rPr>
         <w:t>Mathematics:</w:t>
       </w:r>
@@ -704,16 +610,14 @@
         </w:numPr>
         <w:spacing w:before="60" w:after="60"/>
         <w:rPr>
-          <w:rFonts w:asciiTheme="minorHAnsi" w:hAnsiTheme="minorHAnsi" w:cstheme="minorHAnsi"/>
-          <w:sz w:val="24"/>
-          <w:szCs w:val="24"/>
-        </w:rPr>
-      </w:pPr>
-      <w:r>
-        <w:rPr>
-          <w:rFonts w:asciiTheme="minorHAnsi" w:hAnsiTheme="minorHAnsi" w:cstheme="minorHAnsi"/>
-          <w:sz w:val="24"/>
-          <w:szCs w:val="24"/>
+          <w:sz w:val="20"/>
+          <w:szCs w:val="20"/>
+        </w:rPr>
+      </w:pPr>
+      <w:r>
+        <w:rPr>
+          <w:sz w:val="20"/>
+          <w:szCs w:val="20"/>
         </w:rPr>
         <w:t>Explain what ‘older by 4’ means as an additive relationship</w:t>
       </w:r>
@@ -727,16 +631,14 @@
         </w:numPr>
         <w:spacing w:before="60" w:after="60"/>
         <w:rPr>
-          <w:rFonts w:asciiTheme="minorHAnsi" w:hAnsiTheme="minorHAnsi" w:cstheme="minorHAnsi"/>
-          <w:sz w:val="24"/>
-          <w:szCs w:val="24"/>
-        </w:rPr>
-      </w:pPr>
-      <w:r>
-        <w:rPr>
-          <w:rFonts w:asciiTheme="minorHAnsi" w:hAnsiTheme="minorHAnsi" w:cstheme="minorHAnsi"/>
-          <w:sz w:val="24"/>
-          <w:szCs w:val="24"/>
+          <w:sz w:val="20"/>
+          <w:szCs w:val="20"/>
+        </w:rPr>
+      </w:pPr>
+      <w:r>
+        <w:rPr>
+          <w:sz w:val="20"/>
+          <w:szCs w:val="20"/>
         </w:rPr>
         <w:t>Write the algebraic expression x + 4 and equation y = x + 4</w:t>
       </w:r>
@@ -750,16 +652,14 @@
         </w:numPr>
         <w:spacing w:before="60" w:after="60"/>
         <w:rPr>
-          <w:rFonts w:asciiTheme="minorHAnsi" w:hAnsiTheme="minorHAnsi" w:cstheme="minorHAnsi"/>
-          <w:sz w:val="24"/>
-          <w:szCs w:val="24"/>
-        </w:rPr>
-      </w:pPr>
-      <w:r>
-        <w:rPr>
-          <w:rFonts w:asciiTheme="minorHAnsi" w:hAnsiTheme="minorHAnsi" w:cstheme="minorHAnsi"/>
-          <w:sz w:val="24"/>
-          <w:szCs w:val="24"/>
+          <w:sz w:val="20"/>
+          <w:szCs w:val="20"/>
+        </w:rPr>
+      </w:pPr>
+      <w:r>
+        <w:rPr>
+          <w:sz w:val="20"/>
+          <w:szCs w:val="20"/>
         </w:rPr>
         <w:t>Identify x and y as two distinct variables representing related quantities</w:t>
       </w:r>
@@ -773,16 +673,14 @@
         </w:numPr>
         <w:spacing w:before="60" w:after="60"/>
         <w:rPr>
-          <w:rFonts w:asciiTheme="minorHAnsi" w:hAnsiTheme="minorHAnsi" w:cstheme="minorHAnsi"/>
-          <w:sz w:val="24"/>
-          <w:szCs w:val="24"/>
-        </w:rPr>
-      </w:pPr>
-      <w:r>
-        <w:rPr>
-          <w:rFonts w:asciiTheme="minorHAnsi" w:hAnsiTheme="minorHAnsi" w:cstheme="minorHAnsi"/>
-          <w:sz w:val="24"/>
-          <w:szCs w:val="24"/>
+          <w:sz w:val="20"/>
+          <w:szCs w:val="20"/>
+        </w:rPr>
+      </w:pPr>
+      <w:r>
+        <w:rPr>
+          <w:sz w:val="20"/>
+          <w:szCs w:val="20"/>
         </w:rPr>
         <w:t>Read a linear graph and describe what it shows in real-life terms</w:t>
       </w:r>
@@ -790,9 +688,8 @@
     <w:p>
       <w:pPr>
         <w:rPr>
-          <w:rFonts w:asciiTheme="minorHAnsi" w:hAnsiTheme="minorHAnsi" w:cstheme="minorHAnsi"/>
-          <w:sz w:val="24"/>
-          <w:szCs w:val="24"/>
+          <w:sz w:val="20"/>
+          <w:szCs w:val="20"/>
         </w:rPr>
       </w:pPr>
     </w:p>
@@ -800,18 +697,16 @@
       <w:pPr>
         <w:spacing w:before="80" w:after="80"/>
         <w:rPr>
-          <w:rFonts w:asciiTheme="minorHAnsi" w:hAnsiTheme="minorHAnsi" w:cstheme="minorHAnsi"/>
-          <w:sz w:val="24"/>
-          <w:szCs w:val="24"/>
-        </w:rPr>
-      </w:pPr>
-      <w:r>
-        <w:rPr>
-          <w:rFonts w:asciiTheme="minorHAnsi" w:hAnsiTheme="minorHAnsi" w:cstheme="minorHAnsi"/>
+          <w:sz w:val="20"/>
+          <w:szCs w:val="20"/>
+        </w:rPr>
+      </w:pPr>
+      <w:r>
+        <w:rPr>
           <w:b/>
           <w:bCs/>
-          <w:sz w:val="24"/>
-          <w:szCs w:val="24"/>
+          <w:sz w:val="20"/>
+          <w:szCs w:val="20"/>
         </w:rPr>
         <w:t>Computational Thinking:</w:t>
       </w:r>
@@ -825,36 +720,16 @@
         </w:numPr>
         <w:spacing w:before="60" w:after="60"/>
         <w:rPr>
-          <w:rFonts w:asciiTheme="minorHAnsi" w:hAnsiTheme="minorHAnsi" w:cstheme="minorHAnsi"/>
-          <w:sz w:val="24"/>
-          <w:szCs w:val="24"/>
-        </w:rPr>
-      </w:pPr>
-      <w:r>
-        <w:rPr>
-          <w:rFonts w:asciiTheme="minorHAnsi" w:hAnsiTheme="minorHAnsi" w:cstheme="minorHAnsi"/>
-          <w:sz w:val="24"/>
-          <w:szCs w:val="24"/>
-        </w:rPr>
-        <w:t xml:space="preserve">Define a </w:t>
-      </w:r>
-      <w:proofErr w:type="spellStart"/>
-      <w:r>
-        <w:rPr>
-          <w:rFonts w:asciiTheme="minorHAnsi" w:hAnsiTheme="minorHAnsi" w:cstheme="minorHAnsi"/>
-          <w:sz w:val="24"/>
-          <w:szCs w:val="24"/>
-        </w:rPr>
-        <w:t>Pyret</w:t>
-      </w:r>
-      <w:proofErr w:type="spellEnd"/>
-      <w:r>
-        <w:rPr>
-          <w:rFonts w:asciiTheme="minorHAnsi" w:hAnsiTheme="minorHAnsi" w:cstheme="minorHAnsi"/>
-          <w:sz w:val="24"/>
-          <w:szCs w:val="24"/>
-        </w:rPr>
-        <w:t xml:space="preserve"> function that encodes the algebraic rule</w:t>
+          <w:sz w:val="20"/>
+          <w:szCs w:val="20"/>
+        </w:rPr>
+      </w:pPr>
+      <w:r>
+        <w:rPr>
+          <w:sz w:val="20"/>
+          <w:szCs w:val="20"/>
+        </w:rPr>
+        <w:t>Define a Pyret function that encodes the algebraic rule</w:t>
       </w:r>
     </w:p>
     <w:p>
@@ -866,16 +741,14 @@
         </w:numPr>
         <w:spacing w:before="60" w:after="60"/>
         <w:rPr>
-          <w:rFonts w:asciiTheme="minorHAnsi" w:hAnsiTheme="minorHAnsi" w:cstheme="minorHAnsi"/>
-          <w:sz w:val="24"/>
-          <w:szCs w:val="24"/>
-        </w:rPr>
-      </w:pPr>
-      <w:r>
-        <w:rPr>
-          <w:rFonts w:asciiTheme="minorHAnsi" w:hAnsiTheme="minorHAnsi" w:cstheme="minorHAnsi"/>
-          <w:sz w:val="24"/>
-          <w:szCs w:val="24"/>
+          <w:sz w:val="20"/>
+          <w:szCs w:val="20"/>
+        </w:rPr>
+      </w:pPr>
+      <w:r>
+        <w:rPr>
+          <w:sz w:val="20"/>
+          <w:szCs w:val="20"/>
         </w:rPr>
         <w:t>Test the function with concrete values using check cases</w:t>
       </w:r>
@@ -889,16 +762,14 @@
         </w:numPr>
         <w:spacing w:before="60" w:after="60"/>
         <w:rPr>
-          <w:rFonts w:asciiTheme="minorHAnsi" w:hAnsiTheme="minorHAnsi" w:cstheme="minorHAnsi"/>
-          <w:sz w:val="24"/>
-          <w:szCs w:val="24"/>
-        </w:rPr>
-      </w:pPr>
-      <w:r>
-        <w:rPr>
-          <w:rFonts w:asciiTheme="minorHAnsi" w:hAnsiTheme="minorHAnsi" w:cstheme="minorHAnsi"/>
-          <w:sz w:val="24"/>
-          <w:szCs w:val="24"/>
+          <w:sz w:val="20"/>
+          <w:szCs w:val="20"/>
+        </w:rPr>
+      </w:pPr>
+      <w:r>
+        <w:rPr>
+          <w:sz w:val="20"/>
+          <w:szCs w:val="20"/>
         </w:rPr>
         <w:t>Connect the function, expression, and graph as three representations of the same relationship</w:t>
       </w:r>
@@ -906,9 +777,8 @@
     <w:p>
       <w:pPr>
         <w:rPr>
-          <w:rFonts w:asciiTheme="minorHAnsi" w:hAnsiTheme="minorHAnsi" w:cstheme="minorHAnsi"/>
-          <w:sz w:val="24"/>
-          <w:szCs w:val="24"/>
+          <w:sz w:val="20"/>
+          <w:szCs w:val="20"/>
         </w:rPr>
       </w:pPr>
     </w:p>
@@ -916,18 +786,16 @@
       <w:pPr>
         <w:spacing w:before="80" w:after="80"/>
         <w:rPr>
-          <w:rFonts w:asciiTheme="minorHAnsi" w:hAnsiTheme="minorHAnsi" w:cstheme="minorHAnsi"/>
-          <w:sz w:val="24"/>
-          <w:szCs w:val="24"/>
-        </w:rPr>
-      </w:pPr>
-      <w:r>
-        <w:rPr>
-          <w:rFonts w:asciiTheme="minorHAnsi" w:hAnsiTheme="minorHAnsi" w:cstheme="minorHAnsi"/>
+          <w:sz w:val="20"/>
+          <w:szCs w:val="20"/>
+        </w:rPr>
+      </w:pPr>
+      <w:r>
+        <w:rPr>
           <w:b/>
           <w:bCs/>
-          <w:sz w:val="24"/>
-          <w:szCs w:val="24"/>
+          <w:sz w:val="20"/>
+          <w:szCs w:val="20"/>
         </w:rPr>
         <w:t>I Can Statements:</w:t>
       </w:r>
@@ -941,16 +809,14 @@
         </w:numPr>
         <w:spacing w:before="60" w:after="60"/>
         <w:rPr>
-          <w:rFonts w:asciiTheme="minorHAnsi" w:hAnsiTheme="minorHAnsi" w:cstheme="minorHAnsi"/>
-          <w:sz w:val="24"/>
-          <w:szCs w:val="24"/>
-        </w:rPr>
-      </w:pPr>
-      <w:r>
-        <w:rPr>
-          <w:rFonts w:asciiTheme="minorHAnsi" w:hAnsiTheme="minorHAnsi" w:cstheme="minorHAnsi"/>
-          <w:sz w:val="24"/>
-          <w:szCs w:val="24"/>
+          <w:sz w:val="20"/>
+          <w:szCs w:val="20"/>
+        </w:rPr>
+      </w:pPr>
+      <w:r>
+        <w:rPr>
+          <w:sz w:val="20"/>
+          <w:szCs w:val="20"/>
         </w:rPr>
         <w:t>I can explain what a variable is and why we need one</w:t>
       </w:r>
@@ -964,16 +830,14 @@
         </w:numPr>
         <w:spacing w:before="60" w:after="60"/>
         <w:rPr>
-          <w:rFonts w:asciiTheme="minorHAnsi" w:hAnsiTheme="minorHAnsi" w:cstheme="minorHAnsi"/>
-          <w:sz w:val="24"/>
-          <w:szCs w:val="24"/>
-        </w:rPr>
-      </w:pPr>
-      <w:r>
-        <w:rPr>
-          <w:rFonts w:asciiTheme="minorHAnsi" w:hAnsiTheme="minorHAnsi" w:cstheme="minorHAnsi"/>
-          <w:sz w:val="24"/>
-          <w:szCs w:val="24"/>
+          <w:sz w:val="20"/>
+          <w:szCs w:val="20"/>
+        </w:rPr>
+      </w:pPr>
+      <w:r>
+        <w:rPr>
+          <w:sz w:val="20"/>
+          <w:szCs w:val="20"/>
         </w:rPr>
         <w:t>I can write an algebraic expression for a real-life relationship</w:t>
       </w:r>
@@ -987,18 +851,15 @@
         </w:numPr>
         <w:spacing w:before="60" w:after="60"/>
         <w:rPr>
-          <w:rFonts w:asciiTheme="minorHAnsi" w:hAnsiTheme="minorHAnsi" w:cstheme="minorHAnsi"/>
-          <w:sz w:val="24"/>
-          <w:szCs w:val="24"/>
-        </w:rPr>
-      </w:pPr>
-      <w:r>
-        <w:rPr>
-          <w:rFonts w:asciiTheme="minorHAnsi" w:hAnsiTheme="minorHAnsi" w:cstheme="minorHAnsi"/>
-          <w:sz w:val="24"/>
-          <w:szCs w:val="24"/>
-        </w:rPr>
-        <w:lastRenderedPageBreak/>
+          <w:sz w:val="20"/>
+          <w:szCs w:val="20"/>
+        </w:rPr>
+      </w:pPr>
+      <w:r>
+        <w:rPr>
+          <w:sz w:val="20"/>
+          <w:szCs w:val="20"/>
+        </w:rPr>
         <w:t>I can read a graph and explain what it shows in real-life terms</w:t>
       </w:r>
     </w:p>
@@ -1011,54 +872,32 @@
         </w:numPr>
         <w:spacing w:before="60" w:after="60"/>
         <w:rPr>
-          <w:rFonts w:asciiTheme="minorHAnsi" w:hAnsiTheme="minorHAnsi" w:cstheme="minorHAnsi"/>
-          <w:sz w:val="24"/>
-          <w:szCs w:val="24"/>
-        </w:rPr>
-      </w:pPr>
-      <w:r>
-        <w:rPr>
-          <w:rFonts w:asciiTheme="minorHAnsi" w:hAnsiTheme="minorHAnsi" w:cstheme="minorHAnsi"/>
-          <w:sz w:val="24"/>
-          <w:szCs w:val="24"/>
-        </w:rPr>
-        <w:t xml:space="preserve">I can write and test a function in </w:t>
-      </w:r>
-      <w:proofErr w:type="spellStart"/>
-      <w:r>
-        <w:rPr>
-          <w:rFonts w:asciiTheme="minorHAnsi" w:hAnsiTheme="minorHAnsi" w:cstheme="minorHAnsi"/>
-          <w:sz w:val="24"/>
-          <w:szCs w:val="24"/>
-        </w:rPr>
-        <w:t>Pyret</w:t>
-      </w:r>
-      <w:proofErr w:type="spellEnd"/>
-      <w:r>
-        <w:rPr>
-          <w:rFonts w:asciiTheme="minorHAnsi" w:hAnsiTheme="minorHAnsi" w:cstheme="minorHAnsi"/>
-          <w:sz w:val="24"/>
-          <w:szCs w:val="24"/>
-        </w:rPr>
-        <w:t xml:space="preserve"> that matches my algebraic rule</w:t>
+          <w:sz w:val="20"/>
+          <w:szCs w:val="20"/>
+        </w:rPr>
+      </w:pPr>
+      <w:r>
+        <w:rPr>
+          <w:sz w:val="20"/>
+          <w:szCs w:val="20"/>
+        </w:rPr>
+        <w:t>I can write and test a function in Pyret that matches my algebraic rule</w:t>
       </w:r>
     </w:p>
     <w:p>
       <w:pPr>
         <w:pStyle w:val="Heading1"/>
         <w:rPr>
-          <w:rFonts w:asciiTheme="minorHAnsi" w:hAnsiTheme="minorHAnsi" w:cstheme="minorHAnsi"/>
           <w:color w:val="auto"/>
-          <w:sz w:val="24"/>
-          <w:szCs w:val="24"/>
-        </w:rPr>
-      </w:pPr>
-      <w:r>
-        <w:rPr>
-          <w:rFonts w:asciiTheme="minorHAnsi" w:hAnsiTheme="minorHAnsi" w:cstheme="minorHAnsi"/>
+          <w:sz w:val="20"/>
+          <w:szCs w:val="20"/>
+        </w:rPr>
+      </w:pPr>
+      <w:r>
+        <w:rPr>
           <w:color w:val="auto"/>
-          <w:sz w:val="24"/>
-          <w:szCs w:val="24"/>
+          <w:sz w:val="20"/>
+          <w:szCs w:val="20"/>
         </w:rPr>
         <w:t>Materials</w:t>
       </w:r>
@@ -1072,16 +911,14 @@
         </w:numPr>
         <w:spacing w:before="60" w:after="60"/>
         <w:rPr>
-          <w:rFonts w:asciiTheme="minorHAnsi" w:hAnsiTheme="minorHAnsi" w:cstheme="minorHAnsi"/>
-          <w:sz w:val="24"/>
-          <w:szCs w:val="24"/>
-        </w:rPr>
-      </w:pPr>
-      <w:r>
-        <w:rPr>
-          <w:rFonts w:asciiTheme="minorHAnsi" w:hAnsiTheme="minorHAnsi" w:cstheme="minorHAnsi"/>
-          <w:sz w:val="24"/>
-          <w:szCs w:val="24"/>
+          <w:sz w:val="20"/>
+          <w:szCs w:val="20"/>
+        </w:rPr>
+      </w:pPr>
+      <w:r>
+        <w:rPr>
+          <w:sz w:val="20"/>
+          <w:szCs w:val="20"/>
         </w:rPr>
         <w:t>Algebra IDE open in browser (one device per student)</w:t>
       </w:r>
@@ -1095,16 +932,14 @@
         </w:numPr>
         <w:spacing w:before="60" w:after="60"/>
         <w:rPr>
-          <w:rFonts w:asciiTheme="minorHAnsi" w:hAnsiTheme="minorHAnsi" w:cstheme="minorHAnsi"/>
-          <w:sz w:val="24"/>
-          <w:szCs w:val="24"/>
-        </w:rPr>
-      </w:pPr>
-      <w:r>
-        <w:rPr>
-          <w:rFonts w:asciiTheme="minorHAnsi" w:hAnsiTheme="minorHAnsi" w:cstheme="minorHAnsi"/>
-          <w:sz w:val="24"/>
-          <w:szCs w:val="24"/>
+          <w:sz w:val="20"/>
+          <w:szCs w:val="20"/>
+        </w:rPr>
+      </w:pPr>
+      <w:r>
+        <w:rPr>
+          <w:sz w:val="20"/>
+          <w:szCs w:val="20"/>
         </w:rPr>
         <w:t>Problem written on the board: ‘Thamarai is 4 years older than Selvi. If Selvi is x years old, how old is Thamarai?’</w:t>
       </w:r>
@@ -1118,16 +953,14 @@
         </w:numPr>
         <w:spacing w:before="60" w:after="60"/>
         <w:rPr>
-          <w:rFonts w:asciiTheme="minorHAnsi" w:hAnsiTheme="minorHAnsi" w:cstheme="minorHAnsi"/>
-          <w:sz w:val="24"/>
-          <w:szCs w:val="24"/>
-        </w:rPr>
-      </w:pPr>
-      <w:r>
-        <w:rPr>
-          <w:rFonts w:asciiTheme="minorHAnsi" w:hAnsiTheme="minorHAnsi" w:cstheme="minorHAnsi"/>
-          <w:sz w:val="24"/>
-          <w:szCs w:val="24"/>
+          <w:sz w:val="20"/>
+          <w:szCs w:val="20"/>
+        </w:rPr>
+      </w:pPr>
+      <w:r>
+        <w:rPr>
+          <w:sz w:val="20"/>
+          <w:szCs w:val="20"/>
         </w:rPr>
         <w:t>Optional: printed Step 5 table for students who benefit from physical materials</w:t>
       </w:r>
@@ -1136,19 +969,18 @@
       <w:pPr>
         <w:pStyle w:val="Heading1"/>
         <w:rPr>
-          <w:rFonts w:asciiTheme="minorHAnsi" w:hAnsiTheme="minorHAnsi" w:cstheme="minorHAnsi"/>
           <w:color w:val="auto"/>
-          <w:sz w:val="24"/>
-          <w:szCs w:val="24"/>
-        </w:rPr>
-      </w:pPr>
-      <w:r>
-        <w:rPr>
-          <w:rFonts w:asciiTheme="minorHAnsi" w:hAnsiTheme="minorHAnsi" w:cstheme="minorHAnsi"/>
+          <w:sz w:val="20"/>
+          <w:szCs w:val="20"/>
+        </w:rPr>
+      </w:pPr>
+      <w:r>
+        <w:rPr>
           <w:color w:val="auto"/>
-          <w:sz w:val="24"/>
-          <w:szCs w:val="24"/>
-        </w:rPr>
+          <w:sz w:val="20"/>
+          <w:szCs w:val="20"/>
+        </w:rPr>
+        <w:lastRenderedPageBreak/>
         <w:t>Before Class — Teacher Preparation</w:t>
       </w:r>
     </w:p>
@@ -1161,16 +993,14 @@
         </w:numPr>
         <w:spacing w:before="60" w:after="60"/>
         <w:rPr>
-          <w:rFonts w:asciiTheme="minorHAnsi" w:hAnsiTheme="minorHAnsi" w:cstheme="minorHAnsi"/>
-          <w:sz w:val="24"/>
-          <w:szCs w:val="24"/>
-        </w:rPr>
-      </w:pPr>
-      <w:r>
-        <w:rPr>
-          <w:rFonts w:asciiTheme="minorHAnsi" w:hAnsiTheme="minorHAnsi" w:cstheme="minorHAnsi"/>
-          <w:sz w:val="24"/>
-          <w:szCs w:val="24"/>
+          <w:sz w:val="20"/>
+          <w:szCs w:val="20"/>
+        </w:rPr>
+      </w:pPr>
+      <w:r>
+        <w:rPr>
+          <w:sz w:val="20"/>
+          <w:szCs w:val="20"/>
         </w:rPr>
         <w:t>Test the IDE in the browser students will use and confirm the Desmos graph loads correctly</w:t>
       </w:r>
@@ -1184,16 +1014,14 @@
         </w:numPr>
         <w:spacing w:before="60" w:after="60"/>
         <w:rPr>
-          <w:rFonts w:asciiTheme="minorHAnsi" w:hAnsiTheme="minorHAnsi" w:cstheme="minorHAnsi"/>
-          <w:sz w:val="24"/>
-          <w:szCs w:val="24"/>
-        </w:rPr>
-      </w:pPr>
-      <w:r>
-        <w:rPr>
-          <w:rFonts w:asciiTheme="minorHAnsi" w:hAnsiTheme="minorHAnsi" w:cstheme="minorHAnsi"/>
-          <w:sz w:val="24"/>
-          <w:szCs w:val="24"/>
+          <w:sz w:val="20"/>
+          <w:szCs w:val="20"/>
+        </w:rPr>
+      </w:pPr>
+      <w:r>
+        <w:rPr>
+          <w:sz w:val="20"/>
+          <w:szCs w:val="20"/>
         </w:rPr>
         <w:t>Write the central problem on the board before students arrive</w:t>
       </w:r>
@@ -1207,16 +1035,14 @@
         </w:numPr>
         <w:spacing w:before="60" w:after="60"/>
         <w:rPr>
-          <w:rFonts w:asciiTheme="minorHAnsi" w:hAnsiTheme="minorHAnsi" w:cstheme="minorHAnsi"/>
-          <w:sz w:val="24"/>
-          <w:szCs w:val="24"/>
-        </w:rPr>
-      </w:pPr>
-      <w:r>
-        <w:rPr>
-          <w:rFonts w:asciiTheme="minorHAnsi" w:hAnsiTheme="minorHAnsi" w:cstheme="minorHAnsi"/>
-          <w:sz w:val="24"/>
-          <w:szCs w:val="24"/>
+          <w:sz w:val="20"/>
+          <w:szCs w:val="20"/>
+        </w:rPr>
+      </w:pPr>
+      <w:r>
+        <w:rPr>
+          <w:sz w:val="20"/>
+          <w:szCs w:val="20"/>
         </w:rPr>
         <w:t>Prepare the warm-up question (see Engage phase below)</w:t>
       </w:r>
@@ -1230,32 +1056,28 @@
         </w:numPr>
         <w:spacing w:before="60" w:after="60"/>
         <w:rPr>
-          <w:rFonts w:asciiTheme="minorHAnsi" w:hAnsiTheme="minorHAnsi" w:cstheme="minorHAnsi"/>
-          <w:sz w:val="24"/>
-          <w:szCs w:val="24"/>
-        </w:rPr>
-      </w:pPr>
-      <w:r>
-        <w:rPr>
-          <w:rFonts w:asciiTheme="minorHAnsi" w:hAnsiTheme="minorHAnsi" w:cstheme="minorHAnsi"/>
-          <w:sz w:val="24"/>
-          <w:szCs w:val="24"/>
+          <w:sz w:val="20"/>
+          <w:szCs w:val="20"/>
+        </w:rPr>
+      </w:pPr>
+      <w:r>
+        <w:rPr>
+          <w:sz w:val="20"/>
+          <w:szCs w:val="20"/>
         </w:rPr>
         <w:t xml:space="preserve">Identify </w:t>
       </w:r>
       <w:r>
         <w:rPr>
-          <w:rFonts w:asciiTheme="minorHAnsi" w:hAnsiTheme="minorHAnsi" w:cstheme="minorHAnsi"/>
-          <w:sz w:val="24"/>
-          <w:szCs w:val="24"/>
+          <w:sz w:val="20"/>
+          <w:szCs w:val="20"/>
         </w:rPr>
         <w:t>the</w:t>
       </w:r>
       <w:r>
         <w:rPr>
-          <w:rFonts w:asciiTheme="minorHAnsi" w:hAnsiTheme="minorHAnsi" w:cstheme="minorHAnsi"/>
-          <w:sz w:val="24"/>
-          <w:szCs w:val="24"/>
+          <w:sz w:val="20"/>
+          <w:szCs w:val="20"/>
         </w:rPr>
         <w:t xml:space="preserve"> students in advance who may need extra support at Step 4 (expression writing)</w:t>
       </w:r>
@@ -1269,32 +1091,28 @@
         </w:numPr>
         <w:spacing w:before="60" w:after="60"/>
         <w:rPr>
-          <w:rFonts w:asciiTheme="minorHAnsi" w:hAnsiTheme="minorHAnsi" w:cstheme="minorHAnsi"/>
-          <w:sz w:val="24"/>
-          <w:szCs w:val="24"/>
-        </w:rPr>
-      </w:pPr>
-      <w:r>
-        <w:rPr>
-          <w:rFonts w:asciiTheme="minorHAnsi" w:hAnsiTheme="minorHAnsi" w:cstheme="minorHAnsi"/>
-          <w:sz w:val="24"/>
-          <w:szCs w:val="24"/>
+          <w:sz w:val="20"/>
+          <w:szCs w:val="20"/>
+        </w:rPr>
+      </w:pPr>
+      <w:r>
+        <w:rPr>
+          <w:sz w:val="20"/>
+          <w:szCs w:val="20"/>
         </w:rPr>
         <w:t xml:space="preserve">Review AI validation behaviour in Steps </w:t>
       </w:r>
       <w:r>
         <w:rPr>
-          <w:rFonts w:asciiTheme="minorHAnsi" w:hAnsiTheme="minorHAnsi" w:cstheme="minorHAnsi"/>
-          <w:sz w:val="24"/>
-          <w:szCs w:val="24"/>
+          <w:sz w:val="20"/>
+          <w:szCs w:val="20"/>
         </w:rPr>
         <w:t>to</w:t>
       </w:r>
       <w:r>
         <w:rPr>
-          <w:rFonts w:asciiTheme="minorHAnsi" w:hAnsiTheme="minorHAnsi" w:cstheme="minorHAnsi"/>
-          <w:sz w:val="24"/>
-          <w:szCs w:val="24"/>
+          <w:sz w:val="20"/>
+          <w:szCs w:val="20"/>
         </w:rPr>
         <w:t xml:space="preserve"> be ready to support students who receive unexpected feedback</w:t>
       </w:r>
@@ -1303,18 +1121,16 @@
       <w:pPr>
         <w:pStyle w:val="Heading1"/>
         <w:rPr>
-          <w:rFonts w:asciiTheme="minorHAnsi" w:hAnsiTheme="minorHAnsi" w:cstheme="minorHAnsi"/>
           <w:color w:val="auto"/>
-          <w:sz w:val="24"/>
-          <w:szCs w:val="24"/>
-        </w:rPr>
-      </w:pPr>
-      <w:r>
-        <w:rPr>
-          <w:rFonts w:asciiTheme="minorHAnsi" w:hAnsiTheme="minorHAnsi" w:cstheme="minorHAnsi"/>
+          <w:sz w:val="20"/>
+          <w:szCs w:val="20"/>
+        </w:rPr>
+      </w:pPr>
+      <w:r>
+        <w:rPr>
           <w:color w:val="auto"/>
-          <w:sz w:val="24"/>
-          <w:szCs w:val="24"/>
+          <w:sz w:val="20"/>
+          <w:szCs w:val="20"/>
         </w:rPr>
         <w:t>5E Lesson Phases</w:t>
       </w:r>
@@ -1323,18 +1139,16 @@
       <w:pPr>
         <w:pStyle w:val="Heading2"/>
         <w:rPr>
-          <w:rFonts w:asciiTheme="minorHAnsi" w:hAnsiTheme="minorHAnsi" w:cstheme="minorHAnsi"/>
           <w:color w:val="auto"/>
-          <w:sz w:val="24"/>
-          <w:szCs w:val="24"/>
-        </w:rPr>
-      </w:pPr>
-      <w:r>
-        <w:rPr>
-          <w:rFonts w:asciiTheme="minorHAnsi" w:hAnsiTheme="minorHAnsi" w:cstheme="minorHAnsi"/>
+          <w:sz w:val="20"/>
+          <w:szCs w:val="20"/>
+        </w:rPr>
+      </w:pPr>
+      <w:r>
+        <w:rPr>
           <w:color w:val="auto"/>
-          <w:sz w:val="24"/>
-          <w:szCs w:val="24"/>
+          <w:sz w:val="20"/>
+          <w:szCs w:val="20"/>
         </w:rPr>
         <w:t>1. ENGAGE — 10–12 minutes</w:t>
       </w:r>
@@ -1343,16 +1157,14 @@
       <w:pPr>
         <w:spacing w:before="80" w:after="80"/>
         <w:rPr>
-          <w:rFonts w:asciiTheme="minorHAnsi" w:hAnsiTheme="minorHAnsi" w:cstheme="minorHAnsi"/>
-          <w:sz w:val="24"/>
-          <w:szCs w:val="24"/>
-        </w:rPr>
-      </w:pPr>
-      <w:r>
-        <w:rPr>
-          <w:rFonts w:asciiTheme="minorHAnsi" w:hAnsiTheme="minorHAnsi" w:cstheme="minorHAnsi"/>
-          <w:sz w:val="24"/>
-          <w:szCs w:val="24"/>
+          <w:sz w:val="20"/>
+          <w:szCs w:val="20"/>
+        </w:rPr>
+      </w:pPr>
+      <w:r>
+        <w:rPr>
+          <w:sz w:val="20"/>
+          <w:szCs w:val="20"/>
         </w:rPr>
         <w:t>Goal: Activate prior knowledge and connect to students’ experience before opening the IDE.</w:t>
       </w:r>
@@ -1361,14 +1173,16 @@
       <w:pPr>
         <w:pStyle w:val="Heading3"/>
         <w:rPr>
-          <w:rFonts w:asciiTheme="minorHAnsi" w:hAnsiTheme="minorHAnsi" w:cstheme="minorHAnsi"/>
           <w:color w:val="auto"/>
-        </w:rPr>
-      </w:pPr>
-      <w:r>
-        <w:rPr>
-          <w:rFonts w:asciiTheme="minorHAnsi" w:hAnsiTheme="minorHAnsi" w:cstheme="minorHAnsi"/>
+          <w:sz w:val="20"/>
+          <w:szCs w:val="20"/>
+        </w:rPr>
+      </w:pPr>
+      <w:r>
+        <w:rPr>
           <w:color w:val="auto"/>
+          <w:sz w:val="20"/>
+          <w:szCs w:val="20"/>
         </w:rPr>
         <w:t>Warm-up (before opening the IDE)</w:t>
       </w:r>
@@ -1377,16 +1191,14 @@
       <w:pPr>
         <w:spacing w:before="80" w:after="80"/>
         <w:rPr>
-          <w:rFonts w:asciiTheme="minorHAnsi" w:hAnsiTheme="minorHAnsi" w:cstheme="minorHAnsi"/>
-          <w:sz w:val="24"/>
-          <w:szCs w:val="24"/>
-        </w:rPr>
-      </w:pPr>
-      <w:r>
-        <w:rPr>
-          <w:rFonts w:asciiTheme="minorHAnsi" w:hAnsiTheme="minorHAnsi" w:cstheme="minorHAnsi"/>
-          <w:sz w:val="24"/>
-          <w:szCs w:val="24"/>
+          <w:sz w:val="20"/>
+          <w:szCs w:val="20"/>
+        </w:rPr>
+      </w:pPr>
+      <w:r>
+        <w:rPr>
+          <w:sz w:val="20"/>
+          <w:szCs w:val="20"/>
         </w:rPr>
         <w:t>Pose this question verbally or on the board:</w:t>
       </w:r>
@@ -1395,18 +1207,16 @@
       <w:pPr>
         <w:spacing w:before="120" w:after="120"/>
         <w:rPr>
-          <w:rFonts w:asciiTheme="minorHAnsi" w:hAnsiTheme="minorHAnsi" w:cstheme="minorHAnsi"/>
-          <w:sz w:val="24"/>
-          <w:szCs w:val="24"/>
-        </w:rPr>
-      </w:pPr>
-      <w:r>
-        <w:rPr>
-          <w:rFonts w:asciiTheme="minorHAnsi" w:hAnsiTheme="minorHAnsi" w:cstheme="minorHAnsi"/>
+          <w:sz w:val="20"/>
+          <w:szCs w:val="20"/>
+        </w:rPr>
+      </w:pPr>
+      <w:r>
+        <w:rPr>
           <w:i/>
           <w:iCs/>
-          <w:sz w:val="24"/>
-          <w:szCs w:val="24"/>
+          <w:sz w:val="20"/>
+          <w:szCs w:val="20"/>
         </w:rPr>
         <w:t>“My younger sibling is always exactly 4 years younger than me. When I am 15, how old are they? When I am 20? Will that always be true?”</w:t>
       </w:r>
@@ -1415,16 +1225,14 @@
       <w:pPr>
         <w:spacing w:before="80" w:after="80"/>
         <w:rPr>
-          <w:rFonts w:asciiTheme="minorHAnsi" w:hAnsiTheme="minorHAnsi" w:cstheme="minorHAnsi"/>
-          <w:sz w:val="24"/>
-          <w:szCs w:val="24"/>
-        </w:rPr>
-      </w:pPr>
-      <w:r>
-        <w:rPr>
-          <w:rFonts w:asciiTheme="minorHAnsi" w:hAnsiTheme="minorHAnsi" w:cstheme="minorHAnsi"/>
-          <w:sz w:val="24"/>
-          <w:szCs w:val="24"/>
+          <w:sz w:val="20"/>
+          <w:szCs w:val="20"/>
+        </w:rPr>
+      </w:pPr>
+      <w:r>
+        <w:rPr>
+          <w:sz w:val="20"/>
+          <w:szCs w:val="20"/>
         </w:rPr>
         <w:t>Allow 2–3 minutes of think-pair-share. Listen for students noticing the gap stays constant.</w:t>
       </w:r>
@@ -1432,9 +1240,8 @@
     <w:p>
       <w:pPr>
         <w:rPr>
-          <w:rFonts w:asciiTheme="minorHAnsi" w:hAnsiTheme="minorHAnsi" w:cstheme="minorHAnsi"/>
-          <w:sz w:val="24"/>
-          <w:szCs w:val="24"/>
+          <w:sz w:val="20"/>
+          <w:szCs w:val="20"/>
         </w:rPr>
       </w:pPr>
     </w:p>
@@ -1442,16 +1249,14 @@
       <w:pPr>
         <w:spacing w:before="80" w:after="80"/>
         <w:rPr>
-          <w:rFonts w:asciiTheme="minorHAnsi" w:hAnsiTheme="minorHAnsi" w:cstheme="minorHAnsi"/>
-          <w:sz w:val="24"/>
-          <w:szCs w:val="24"/>
-        </w:rPr>
-      </w:pPr>
-      <w:r>
-        <w:rPr>
-          <w:rFonts w:asciiTheme="minorHAnsi" w:hAnsiTheme="minorHAnsi" w:cstheme="minorHAnsi"/>
-          <w:sz w:val="24"/>
-          <w:szCs w:val="24"/>
+          <w:sz w:val="20"/>
+          <w:szCs w:val="20"/>
+        </w:rPr>
+      </w:pPr>
+      <w:r>
+        <w:rPr>
+          <w:sz w:val="20"/>
+          <w:szCs w:val="20"/>
         </w:rPr>
         <w:t>Transition to the IDE:</w:t>
       </w:r>
@@ -1460,18 +1265,16 @@
       <w:pPr>
         <w:spacing w:before="80" w:after="80"/>
         <w:rPr>
-          <w:rFonts w:asciiTheme="minorHAnsi" w:hAnsiTheme="minorHAnsi" w:cstheme="minorHAnsi"/>
-          <w:sz w:val="24"/>
-          <w:szCs w:val="24"/>
-        </w:rPr>
-      </w:pPr>
-      <w:r>
-        <w:rPr>
-          <w:rFonts w:asciiTheme="minorHAnsi" w:hAnsiTheme="minorHAnsi" w:cstheme="minorHAnsi"/>
+          <w:sz w:val="20"/>
+          <w:szCs w:val="20"/>
+        </w:rPr>
+      </w:pPr>
+      <w:r>
+        <w:rPr>
           <w:i/>
           <w:iCs/>
-          <w:sz w:val="24"/>
-          <w:szCs w:val="24"/>
+          <w:sz w:val="20"/>
+          <w:szCs w:val="20"/>
         </w:rPr>
         <w:t>“Today we’ll write one rule that works for any age. That rule is called an algebraic expression.”</w:t>
       </w:r>
@@ -1480,14 +1283,16 @@
       <w:pPr>
         <w:pStyle w:val="Heading3"/>
         <w:rPr>
-          <w:rFonts w:asciiTheme="minorHAnsi" w:hAnsiTheme="minorHAnsi" w:cstheme="minorHAnsi"/>
           <w:color w:val="auto"/>
-        </w:rPr>
-      </w:pPr>
-      <w:r>
-        <w:rPr>
-          <w:rFonts w:asciiTheme="minorHAnsi" w:hAnsiTheme="minorHAnsi" w:cstheme="minorHAnsi"/>
+          <w:sz w:val="20"/>
+          <w:szCs w:val="20"/>
+        </w:rPr>
+      </w:pPr>
+      <w:r>
+        <w:rPr>
           <w:color w:val="auto"/>
+          <w:sz w:val="20"/>
+          <w:szCs w:val="20"/>
         </w:rPr>
         <w:t>Opening the IDE</w:t>
       </w:r>
@@ -1496,44 +1301,23 @@
       <w:pPr>
         <w:spacing w:before="80" w:after="80"/>
         <w:rPr>
-          <w:rFonts w:asciiTheme="minorHAnsi" w:hAnsiTheme="minorHAnsi" w:cstheme="minorHAnsi"/>
-          <w:sz w:val="24"/>
-          <w:szCs w:val="24"/>
-        </w:rPr>
-      </w:pPr>
-      <w:r>
-        <w:rPr>
-          <w:rFonts w:asciiTheme="minorHAnsi" w:hAnsiTheme="minorHAnsi" w:cstheme="minorHAnsi"/>
-          <w:sz w:val="24"/>
-          <w:szCs w:val="24"/>
-        </w:rPr>
-        <w:t>Direct students to open the IDE. Read the problem statement aloud together. Ask: ‘What do we know? What are we trying to find?’ (1–</w:t>
-      </w:r>
-      <w:proofErr w:type="gramStart"/>
-      <w:r>
-        <w:rPr>
-          <w:rFonts w:asciiTheme="minorHAnsi" w:hAnsiTheme="minorHAnsi" w:cstheme="minorHAnsi"/>
-          <w:sz w:val="24"/>
-          <w:szCs w:val="24"/>
-        </w:rPr>
-        <w:t>2 minute</w:t>
-      </w:r>
-      <w:proofErr w:type="gramEnd"/>
-      <w:r>
-        <w:rPr>
-          <w:rFonts w:asciiTheme="minorHAnsi" w:hAnsiTheme="minorHAnsi" w:cstheme="minorHAnsi"/>
-          <w:sz w:val="24"/>
-          <w:szCs w:val="24"/>
-        </w:rPr>
-        <w:t xml:space="preserve"> whole-class discussion before Step 1 begins.)</w:t>
-      </w:r>
-    </w:p>
-    <w:p>
-      <w:pPr>
-        <w:rPr>
-          <w:rFonts w:asciiTheme="minorHAnsi" w:hAnsiTheme="minorHAnsi" w:cstheme="minorHAnsi"/>
-          <w:sz w:val="24"/>
-          <w:szCs w:val="24"/>
+          <w:sz w:val="20"/>
+          <w:szCs w:val="20"/>
+        </w:rPr>
+      </w:pPr>
+      <w:r>
+        <w:rPr>
+          <w:sz w:val="20"/>
+          <w:szCs w:val="20"/>
+        </w:rPr>
+        <w:t>Direct students to open the IDE. Read the problem statement aloud together. Ask: ‘What do we know? What are we trying to find?’ (1–2 minute whole-class discussion before Step 1 begins.)</w:t>
+      </w:r>
+    </w:p>
+    <w:p>
+      <w:pPr>
+        <w:rPr>
+          <w:sz w:val="20"/>
+          <w:szCs w:val="20"/>
         </w:rPr>
       </w:pPr>
     </w:p>
@@ -1541,20 +1325,17 @@
       <w:pPr>
         <w:pStyle w:val="Heading2"/>
         <w:rPr>
-          <w:rFonts w:asciiTheme="minorHAnsi" w:hAnsiTheme="minorHAnsi" w:cstheme="minorHAnsi"/>
           <w:color w:val="auto"/>
-          <w:sz w:val="24"/>
-          <w:szCs w:val="24"/>
-        </w:rPr>
-      </w:pPr>
-      <w:r>
-        <w:rPr>
-          <w:rFonts w:asciiTheme="minorHAnsi" w:hAnsiTheme="minorHAnsi" w:cstheme="minorHAnsi"/>
+          <w:sz w:val="20"/>
+          <w:szCs w:val="20"/>
+        </w:rPr>
+      </w:pPr>
+      <w:r>
+        <w:rPr>
           <w:color w:val="auto"/>
-          <w:sz w:val="24"/>
-          <w:szCs w:val="24"/>
-        </w:rPr>
-        <w:lastRenderedPageBreak/>
+          <w:sz w:val="20"/>
+          <w:szCs w:val="20"/>
+        </w:rPr>
         <w:t>2. EXPLORE — 20–25 minutes</w:t>
       </w:r>
     </w:p>
@@ -1562,16 +1343,14 @@
       <w:pPr>
         <w:spacing w:before="80" w:after="80"/>
         <w:rPr>
-          <w:rFonts w:asciiTheme="minorHAnsi" w:hAnsiTheme="minorHAnsi" w:cstheme="minorHAnsi"/>
-          <w:sz w:val="24"/>
-          <w:szCs w:val="24"/>
-        </w:rPr>
-      </w:pPr>
-      <w:r>
-        <w:rPr>
-          <w:rFonts w:asciiTheme="minorHAnsi" w:hAnsiTheme="minorHAnsi" w:cstheme="minorHAnsi"/>
-          <w:sz w:val="24"/>
-          <w:szCs w:val="24"/>
+          <w:sz w:val="20"/>
+          <w:szCs w:val="20"/>
+        </w:rPr>
+      </w:pPr>
+      <w:r>
+        <w:rPr>
+          <w:sz w:val="20"/>
+          <w:szCs w:val="20"/>
         </w:rPr>
         <w:t>Goal: Students work through Steps 1–5 in the Task tab independently.</w:t>
       </w:r>
@@ -1579,9 +1358,8 @@
     <w:p>
       <w:pPr>
         <w:rPr>
-          <w:rFonts w:asciiTheme="minorHAnsi" w:hAnsiTheme="minorHAnsi" w:cstheme="minorHAnsi"/>
-          <w:sz w:val="24"/>
-          <w:szCs w:val="24"/>
+          <w:sz w:val="20"/>
+          <w:szCs w:val="20"/>
         </w:rPr>
       </w:pPr>
     </w:p>
@@ -1607,12 +1385,6 @@
         <w:gridCol w:w="4680"/>
       </w:tblGrid>
       <w:tr>
-        <w:tblPrEx>
-          <w:tblCellMar>
-            <w:top w:w="0" w:type="dxa"/>
-            <w:bottom w:w="0" w:type="dxa"/>
-          </w:tblCellMar>
-        </w:tblPrEx>
         <w:tc>
           <w:tcPr>
             <w:tcW w:w="4680" w:type="dxa"/>
@@ -1633,18 +1405,16 @@
           <w:p>
             <w:pPr>
               <w:rPr>
-                <w:rFonts w:asciiTheme="minorHAnsi" w:hAnsiTheme="minorHAnsi" w:cstheme="minorHAnsi"/>
-                <w:sz w:val="24"/>
-                <w:szCs w:val="24"/>
-              </w:rPr>
-            </w:pPr>
-            <w:r>
-              <w:rPr>
-                <w:rFonts w:asciiTheme="minorHAnsi" w:hAnsiTheme="minorHAnsi" w:cstheme="minorHAnsi"/>
+                <w:sz w:val="20"/>
+                <w:szCs w:val="20"/>
+              </w:rPr>
+            </w:pPr>
+            <w:r>
+              <w:rPr>
                 <w:b/>
                 <w:bCs/>
-                <w:sz w:val="24"/>
-                <w:szCs w:val="24"/>
+                <w:sz w:val="20"/>
+                <w:szCs w:val="20"/>
               </w:rPr>
               <w:t>IDE Activity</w:t>
             </w:r>
@@ -1670,18 +1440,16 @@
           <w:p>
             <w:pPr>
               <w:rPr>
-                <w:rFonts w:asciiTheme="minorHAnsi" w:hAnsiTheme="minorHAnsi" w:cstheme="minorHAnsi"/>
-                <w:sz w:val="24"/>
-                <w:szCs w:val="24"/>
-              </w:rPr>
-            </w:pPr>
-            <w:r>
-              <w:rPr>
-                <w:rFonts w:asciiTheme="minorHAnsi" w:hAnsiTheme="minorHAnsi" w:cstheme="minorHAnsi"/>
+                <w:sz w:val="20"/>
+                <w:szCs w:val="20"/>
+              </w:rPr>
+            </w:pPr>
+            <w:r>
+              <w:rPr>
                 <w:b/>
                 <w:bCs/>
-                <w:sz w:val="24"/>
-                <w:szCs w:val="24"/>
+                <w:sz w:val="20"/>
+                <w:szCs w:val="20"/>
               </w:rPr>
               <w:t>Teacher Facilitation Notes</w:t>
             </w:r>
@@ -1689,12 +1457,6 @@
         </w:tc>
       </w:tr>
       <w:tr>
-        <w:tblPrEx>
-          <w:tblCellMar>
-            <w:top w:w="0" w:type="dxa"/>
-            <w:bottom w:w="0" w:type="dxa"/>
-          </w:tblCellMar>
-        </w:tblPrEx>
         <w:tc>
           <w:tcPr>
             <w:tcW w:w="4680" w:type="dxa"/>
@@ -1715,16 +1477,14 @@
             <w:pPr>
               <w:spacing w:before="60" w:after="60"/>
               <w:rPr>
-                <w:rFonts w:asciiTheme="minorHAnsi" w:hAnsiTheme="minorHAnsi" w:cstheme="minorHAnsi"/>
-                <w:sz w:val="24"/>
-                <w:szCs w:val="24"/>
-              </w:rPr>
-            </w:pPr>
-            <w:r>
-              <w:rPr>
-                <w:rFonts w:asciiTheme="minorHAnsi" w:hAnsiTheme="minorHAnsi" w:cstheme="minorHAnsi"/>
-                <w:sz w:val="24"/>
-                <w:szCs w:val="24"/>
+                <w:sz w:val="20"/>
+                <w:szCs w:val="20"/>
+              </w:rPr>
+            </w:pPr>
+            <w:r>
+              <w:rPr>
+                <w:sz w:val="20"/>
+                <w:szCs w:val="20"/>
               </w:rPr>
               <w:t>Step 1: Explain ‘older by 4’ in own words (open-ended, AI validated)</w:t>
             </w:r>
@@ -1733,16 +1493,14 @@
             <w:pPr>
               <w:spacing w:before="60" w:after="60"/>
               <w:rPr>
-                <w:rFonts w:asciiTheme="minorHAnsi" w:hAnsiTheme="minorHAnsi" w:cstheme="minorHAnsi"/>
-                <w:sz w:val="24"/>
-                <w:szCs w:val="24"/>
-              </w:rPr>
-            </w:pPr>
-            <w:r>
-              <w:rPr>
-                <w:rFonts w:asciiTheme="minorHAnsi" w:hAnsiTheme="minorHAnsi" w:cstheme="minorHAnsi"/>
-                <w:sz w:val="24"/>
-                <w:szCs w:val="24"/>
+                <w:sz w:val="20"/>
+                <w:szCs w:val="20"/>
+              </w:rPr>
+            </w:pPr>
+            <w:r>
+              <w:rPr>
+                <w:sz w:val="20"/>
+                <w:szCs w:val="20"/>
               </w:rPr>
               <w:t>Step 2: Identify the operation — radio: Addition / Subtraction / Multiplication / Division</w:t>
             </w:r>
@@ -1751,16 +1509,14 @@
             <w:pPr>
               <w:spacing w:before="60" w:after="60"/>
               <w:rPr>
-                <w:rFonts w:asciiTheme="minorHAnsi" w:hAnsiTheme="minorHAnsi" w:cstheme="minorHAnsi"/>
-                <w:sz w:val="24"/>
-                <w:szCs w:val="24"/>
-              </w:rPr>
-            </w:pPr>
-            <w:r>
-              <w:rPr>
-                <w:rFonts w:asciiTheme="minorHAnsi" w:hAnsiTheme="minorHAnsi" w:cstheme="minorHAnsi"/>
-                <w:sz w:val="24"/>
-                <w:szCs w:val="24"/>
+                <w:sz w:val="20"/>
+                <w:szCs w:val="20"/>
+              </w:rPr>
+            </w:pPr>
+            <w:r>
+              <w:rPr>
+                <w:sz w:val="20"/>
+                <w:szCs w:val="20"/>
               </w:rPr>
               <w:t>Step 3: Concrete number — if Selvi is 10, how old is Thamarai?</w:t>
             </w:r>
@@ -1769,48 +1525,42 @@
             <w:pPr>
               <w:spacing w:before="60" w:after="60"/>
               <w:rPr>
-                <w:rFonts w:asciiTheme="minorHAnsi" w:hAnsiTheme="minorHAnsi" w:cstheme="minorHAnsi"/>
-                <w:sz w:val="24"/>
-                <w:szCs w:val="24"/>
-              </w:rPr>
-            </w:pPr>
-            <w:r>
-              <w:rPr>
-                <w:rFonts w:asciiTheme="minorHAnsi" w:hAnsiTheme="minorHAnsi" w:cstheme="minorHAnsi"/>
-                <w:sz w:val="24"/>
-                <w:szCs w:val="24"/>
+                <w:sz w:val="20"/>
+                <w:szCs w:val="20"/>
+              </w:rPr>
+            </w:pPr>
+            <w:r>
+              <w:rPr>
+                <w:sz w:val="20"/>
+                <w:szCs w:val="20"/>
               </w:rPr>
               <w:t xml:space="preserve">Step 4: Build the expression — x </w:t>
             </w:r>
             <w:r>
               <w:rPr>
-                <w:rFonts w:asciiTheme="minorHAnsi" w:hAnsiTheme="minorHAnsi" w:cstheme="minorHAnsi"/>
-                <w:sz w:val="24"/>
-                <w:szCs w:val="24"/>
+                <w:sz w:val="20"/>
+                <w:szCs w:val="20"/>
               </w:rPr>
               <w:t>-&gt;</w:t>
             </w:r>
             <w:r>
               <w:rPr>
-                <w:rFonts w:asciiTheme="minorHAnsi" w:hAnsiTheme="minorHAnsi" w:cstheme="minorHAnsi"/>
-                <w:sz w:val="24"/>
-                <w:szCs w:val="24"/>
+                <w:sz w:val="20"/>
+                <w:szCs w:val="20"/>
               </w:rPr>
               <w:t xml:space="preserve"> operator dropdown </w:t>
             </w:r>
             <w:r>
               <w:rPr>
-                <w:rFonts w:asciiTheme="minorHAnsi" w:hAnsiTheme="minorHAnsi" w:cstheme="minorHAnsi"/>
-                <w:sz w:val="24"/>
-                <w:szCs w:val="24"/>
+                <w:sz w:val="20"/>
+                <w:szCs w:val="20"/>
               </w:rPr>
               <w:t>-&gt;</w:t>
             </w:r>
             <w:r>
               <w:rPr>
-                <w:rFonts w:asciiTheme="minorHAnsi" w:hAnsiTheme="minorHAnsi" w:cstheme="minorHAnsi"/>
-                <w:sz w:val="24"/>
-                <w:szCs w:val="24"/>
+                <w:sz w:val="20"/>
+                <w:szCs w:val="20"/>
               </w:rPr>
               <w:t xml:space="preserve"> number field</w:t>
             </w:r>
@@ -1819,16 +1569,14 @@
             <w:pPr>
               <w:spacing w:before="60" w:after="60"/>
               <w:rPr>
-                <w:rFonts w:asciiTheme="minorHAnsi" w:hAnsiTheme="minorHAnsi" w:cstheme="minorHAnsi"/>
-                <w:sz w:val="24"/>
-                <w:szCs w:val="24"/>
-              </w:rPr>
-            </w:pPr>
-            <w:r>
-              <w:rPr>
-                <w:rFonts w:asciiTheme="minorHAnsi" w:hAnsiTheme="minorHAnsi" w:cstheme="minorHAnsi"/>
-                <w:sz w:val="24"/>
-                <w:szCs w:val="24"/>
+                <w:sz w:val="20"/>
+                <w:szCs w:val="20"/>
+              </w:rPr>
+            </w:pPr>
+            <w:r>
+              <w:rPr>
+                <w:sz w:val="20"/>
+                <w:szCs w:val="20"/>
               </w:rPr>
               <w:t>Confirmation box after Step 4: ‘Thamarai’s age = x + 4. This works for any age!’</w:t>
             </w:r>
@@ -1837,32 +1585,28 @@
             <w:pPr>
               <w:spacing w:before="60" w:after="60"/>
               <w:rPr>
-                <w:rFonts w:asciiTheme="minorHAnsi" w:hAnsiTheme="minorHAnsi" w:cstheme="minorHAnsi"/>
-                <w:sz w:val="24"/>
-                <w:szCs w:val="24"/>
-              </w:rPr>
-            </w:pPr>
-            <w:r>
-              <w:rPr>
-                <w:rFonts w:asciiTheme="minorHAnsi" w:hAnsiTheme="minorHAnsi" w:cstheme="minorHAnsi"/>
-                <w:sz w:val="24"/>
-                <w:szCs w:val="24"/>
+                <w:sz w:val="20"/>
+                <w:szCs w:val="20"/>
+              </w:rPr>
+            </w:pPr>
+            <w:r>
+              <w:rPr>
+                <w:sz w:val="20"/>
+                <w:szCs w:val="20"/>
               </w:rPr>
               <w:t xml:space="preserve">Step 5: Table-bridge </w:t>
             </w:r>
             <w:r>
               <w:rPr>
-                <w:rFonts w:asciiTheme="minorHAnsi" w:hAnsiTheme="minorHAnsi" w:cstheme="minorHAnsi"/>
-                <w:sz w:val="24"/>
-                <w:szCs w:val="24"/>
+                <w:sz w:val="20"/>
+                <w:szCs w:val="20"/>
               </w:rPr>
               <w:t>and</w:t>
             </w:r>
             <w:r>
               <w:rPr>
-                <w:rFonts w:asciiTheme="minorHAnsi" w:hAnsiTheme="minorHAnsi" w:cstheme="minorHAnsi"/>
-                <w:sz w:val="24"/>
-                <w:szCs w:val="24"/>
+                <w:sz w:val="20"/>
+                <w:szCs w:val="20"/>
               </w:rPr>
               <w:t xml:space="preserve"> 3 questions leading to y = x + 4</w:t>
             </w:r>
@@ -1888,18 +1632,16 @@
             <w:pPr>
               <w:spacing w:before="60" w:after="60"/>
               <w:rPr>
-                <w:rFonts w:asciiTheme="minorHAnsi" w:hAnsiTheme="minorHAnsi" w:cstheme="minorHAnsi"/>
-                <w:sz w:val="24"/>
-                <w:szCs w:val="24"/>
-              </w:rPr>
-            </w:pPr>
-            <w:r>
-              <w:rPr>
-                <w:rFonts w:asciiTheme="minorHAnsi" w:hAnsiTheme="minorHAnsi" w:cstheme="minorHAnsi"/>
+                <w:sz w:val="20"/>
+                <w:szCs w:val="20"/>
+              </w:rPr>
+            </w:pPr>
+            <w:r>
+              <w:rPr>
                 <w:b/>
                 <w:bCs/>
-                <w:sz w:val="24"/>
-                <w:szCs w:val="24"/>
+                <w:sz w:val="20"/>
+                <w:szCs w:val="20"/>
               </w:rPr>
               <w:t>Circulate and observe. Avoid giving answers directly.</w:t>
             </w:r>
@@ -1913,16 +1655,14 @@
               </w:numPr>
               <w:spacing w:before="40" w:after="40"/>
               <w:rPr>
-                <w:rFonts w:asciiTheme="minorHAnsi" w:hAnsiTheme="minorHAnsi" w:cstheme="minorHAnsi"/>
-                <w:sz w:val="24"/>
-                <w:szCs w:val="24"/>
-              </w:rPr>
-            </w:pPr>
-            <w:r>
-              <w:rPr>
-                <w:rFonts w:asciiTheme="minorHAnsi" w:hAnsiTheme="minorHAnsi" w:cstheme="minorHAnsi"/>
-                <w:sz w:val="24"/>
-                <w:szCs w:val="24"/>
+                <w:sz w:val="20"/>
+                <w:szCs w:val="20"/>
+              </w:rPr>
+            </w:pPr>
+            <w:r>
+              <w:rPr>
+                <w:sz w:val="20"/>
+                <w:szCs w:val="20"/>
               </w:rPr>
               <w:t>Step 1 stuck: “If you have 10 apples and someone gives you 4 more, what do you do?”</w:t>
             </w:r>
@@ -1936,16 +1676,14 @@
               </w:numPr>
               <w:spacing w:before="40" w:after="40"/>
               <w:rPr>
-                <w:rFonts w:asciiTheme="minorHAnsi" w:hAnsiTheme="minorHAnsi" w:cstheme="minorHAnsi"/>
-                <w:sz w:val="24"/>
-                <w:szCs w:val="24"/>
-              </w:rPr>
-            </w:pPr>
-            <w:r>
-              <w:rPr>
-                <w:rFonts w:asciiTheme="minorHAnsi" w:hAnsiTheme="minorHAnsi" w:cstheme="minorHAnsi"/>
-                <w:sz w:val="24"/>
-                <w:szCs w:val="24"/>
+                <w:sz w:val="20"/>
+                <w:szCs w:val="20"/>
+              </w:rPr>
+            </w:pPr>
+            <w:r>
+              <w:rPr>
+                <w:sz w:val="20"/>
+                <w:szCs w:val="20"/>
               </w:rPr>
               <w:t>Step 4 stuck: “You said the answer is 14 when Selvi is 10. What did you do to get 14?”</w:t>
             </w:r>
@@ -1959,16 +1697,14 @@
               </w:numPr>
               <w:spacing w:before="40" w:after="40"/>
               <w:rPr>
-                <w:rFonts w:asciiTheme="minorHAnsi" w:hAnsiTheme="minorHAnsi" w:cstheme="minorHAnsi"/>
-                <w:sz w:val="24"/>
-                <w:szCs w:val="24"/>
-              </w:rPr>
-            </w:pPr>
-            <w:r>
-              <w:rPr>
-                <w:rFonts w:asciiTheme="minorHAnsi" w:hAnsiTheme="minorHAnsi" w:cstheme="minorHAnsi"/>
-                <w:sz w:val="24"/>
-                <w:szCs w:val="24"/>
+                <w:sz w:val="20"/>
+                <w:szCs w:val="20"/>
+              </w:rPr>
+            </w:pPr>
+            <w:r>
+              <w:rPr>
+                <w:sz w:val="20"/>
+                <w:szCs w:val="20"/>
               </w:rPr>
               <w:t>Step 5 variable question: “If x is already Selvi’s name, can we use x again for something else?”</w:t>
             </w:r>
@@ -1977,9 +1713,8 @@
             <w:pPr>
               <w:spacing w:before="60" w:after="60"/>
               <w:rPr>
-                <w:rFonts w:asciiTheme="minorHAnsi" w:hAnsiTheme="minorHAnsi" w:cstheme="minorHAnsi"/>
-                <w:sz w:val="24"/>
-                <w:szCs w:val="24"/>
+                <w:sz w:val="20"/>
+                <w:szCs w:val="20"/>
               </w:rPr>
             </w:pPr>
           </w:p>
@@ -1987,19 +1722,29 @@
             <w:pPr>
               <w:spacing w:before="60" w:after="60"/>
               <w:rPr>
-                <w:rFonts w:asciiTheme="minorHAnsi" w:hAnsiTheme="minorHAnsi" w:cstheme="minorHAnsi"/>
-                <w:sz w:val="24"/>
-                <w:szCs w:val="24"/>
-              </w:rPr>
-            </w:pPr>
-            <w:r>
-              <w:rPr>
-                <w:rFonts w:asciiTheme="minorHAnsi" w:hAnsiTheme="minorHAnsi" w:cstheme="minorHAnsi"/>
                 <w:b/>
                 <w:bCs/>
-                <w:sz w:val="24"/>
-                <w:szCs w:val="24"/>
-              </w:rPr>
+                <w:sz w:val="20"/>
+                <w:szCs w:val="20"/>
+              </w:rPr>
+            </w:pPr>
+          </w:p>
+          <w:p>
+            <w:pPr>
+              <w:spacing w:before="60" w:after="60"/>
+              <w:rPr>
+                <w:sz w:val="20"/>
+                <w:szCs w:val="20"/>
+              </w:rPr>
+            </w:pPr>
+            <w:r>
+              <w:rPr>
+                <w:b/>
+                <w:bCs/>
+                <w:sz w:val="20"/>
+                <w:szCs w:val="20"/>
+              </w:rPr>
+              <w:lastRenderedPageBreak/>
               <w:t>Watch for:</w:t>
             </w:r>
           </w:p>
@@ -2012,32 +1757,28 @@
               </w:numPr>
               <w:spacing w:before="40" w:after="40"/>
               <w:rPr>
-                <w:rFonts w:asciiTheme="minorHAnsi" w:hAnsiTheme="minorHAnsi" w:cstheme="minorHAnsi"/>
-                <w:sz w:val="24"/>
-                <w:szCs w:val="24"/>
-              </w:rPr>
-            </w:pPr>
-            <w:r>
-              <w:rPr>
-                <w:rFonts w:asciiTheme="minorHAnsi" w:hAnsiTheme="minorHAnsi" w:cstheme="minorHAnsi"/>
-                <w:sz w:val="24"/>
-                <w:szCs w:val="24"/>
+                <w:sz w:val="20"/>
+                <w:szCs w:val="20"/>
+              </w:rPr>
+            </w:pPr>
+            <w:r>
+              <w:rPr>
+                <w:sz w:val="20"/>
+                <w:szCs w:val="20"/>
               </w:rPr>
               <w:t>Students who write ‘add 4’ in Step 1 but cannot write x + 4 in Step 4</w:t>
             </w:r>
             <w:r>
               <w:rPr>
-                <w:rFonts w:asciiTheme="minorHAnsi" w:hAnsiTheme="minorHAnsi" w:cstheme="minorHAnsi"/>
-                <w:sz w:val="24"/>
-                <w:szCs w:val="24"/>
+                <w:sz w:val="20"/>
+                <w:szCs w:val="20"/>
               </w:rPr>
               <w:t xml:space="preserve"> -&gt; there is a</w:t>
             </w:r>
             <w:r>
               <w:rPr>
-                <w:rFonts w:asciiTheme="minorHAnsi" w:hAnsiTheme="minorHAnsi" w:cstheme="minorHAnsi"/>
-                <w:sz w:val="24"/>
-                <w:szCs w:val="24"/>
+                <w:sz w:val="20"/>
+                <w:szCs w:val="20"/>
               </w:rPr>
               <w:t xml:space="preserve"> gap between concrete and symbolic</w:t>
             </w:r>
@@ -2051,40 +1792,35 @@
               </w:numPr>
               <w:spacing w:before="40" w:after="40"/>
               <w:rPr>
-                <w:rFonts w:asciiTheme="minorHAnsi" w:hAnsiTheme="minorHAnsi" w:cstheme="minorHAnsi"/>
-                <w:sz w:val="24"/>
-                <w:szCs w:val="24"/>
-              </w:rPr>
-            </w:pPr>
-            <w:r>
-              <w:rPr>
-                <w:rFonts w:asciiTheme="minorHAnsi" w:hAnsiTheme="minorHAnsi" w:cstheme="minorHAnsi"/>
-                <w:sz w:val="24"/>
-                <w:szCs w:val="24"/>
+                <w:sz w:val="20"/>
+                <w:szCs w:val="20"/>
+              </w:rPr>
+            </w:pPr>
+            <w:r>
+              <w:rPr>
+                <w:sz w:val="20"/>
+                <w:szCs w:val="20"/>
               </w:rPr>
               <w:t xml:space="preserve">Students who choose Subtraction in Step 2 </w:t>
             </w:r>
             <w:r>
               <w:rPr>
-                <w:rFonts w:asciiTheme="minorHAnsi" w:hAnsiTheme="minorHAnsi" w:cstheme="minorHAnsi"/>
-                <w:sz w:val="24"/>
-                <w:szCs w:val="24"/>
+                <w:sz w:val="20"/>
+                <w:szCs w:val="20"/>
               </w:rPr>
               <w:t>-</w:t>
             </w:r>
             <w:r>
               <w:rPr>
-                <w:rFonts w:asciiTheme="minorHAnsi" w:hAnsiTheme="minorHAnsi" w:cstheme="minorHAnsi"/>
-                <w:sz w:val="24"/>
-                <w:szCs w:val="24"/>
+                <w:sz w:val="20"/>
+                <w:szCs w:val="20"/>
               </w:rPr>
               <w:t>&gt;</w:t>
             </w:r>
             <w:r>
               <w:rPr>
-                <w:rFonts w:asciiTheme="minorHAnsi" w:hAnsiTheme="minorHAnsi" w:cstheme="minorHAnsi"/>
-                <w:sz w:val="24"/>
-                <w:szCs w:val="24"/>
+                <w:sz w:val="20"/>
+                <w:szCs w:val="20"/>
               </w:rPr>
               <w:t xml:space="preserve"> address this directly before Step 3</w:t>
             </w:r>
@@ -2095,9 +1831,8 @@
     <w:p>
       <w:pPr>
         <w:rPr>
-          <w:rFonts w:asciiTheme="minorHAnsi" w:hAnsiTheme="minorHAnsi" w:cstheme="minorHAnsi"/>
-          <w:sz w:val="24"/>
-          <w:szCs w:val="24"/>
+          <w:sz w:val="20"/>
+          <w:szCs w:val="20"/>
         </w:rPr>
       </w:pPr>
     </w:p>
@@ -2105,18 +1840,16 @@
       <w:pPr>
         <w:pStyle w:val="Heading2"/>
         <w:rPr>
-          <w:rFonts w:asciiTheme="minorHAnsi" w:hAnsiTheme="minorHAnsi" w:cstheme="minorHAnsi"/>
           <w:color w:val="auto"/>
-          <w:sz w:val="24"/>
-          <w:szCs w:val="24"/>
-        </w:rPr>
-      </w:pPr>
-      <w:r>
-        <w:rPr>
-          <w:rFonts w:asciiTheme="minorHAnsi" w:hAnsiTheme="minorHAnsi" w:cstheme="minorHAnsi"/>
+          <w:sz w:val="20"/>
+          <w:szCs w:val="20"/>
+        </w:rPr>
+      </w:pPr>
+      <w:r>
+        <w:rPr>
           <w:color w:val="auto"/>
-          <w:sz w:val="24"/>
-          <w:szCs w:val="24"/>
+          <w:sz w:val="20"/>
+          <w:szCs w:val="20"/>
         </w:rPr>
         <w:t>3. EXPLAIN — 8–10 minutes</w:t>
       </w:r>
@@ -2125,16 +1858,14 @@
       <w:pPr>
         <w:spacing w:before="80" w:after="80"/>
         <w:rPr>
-          <w:rFonts w:asciiTheme="minorHAnsi" w:hAnsiTheme="minorHAnsi" w:cstheme="minorHAnsi"/>
-          <w:sz w:val="24"/>
-          <w:szCs w:val="24"/>
-        </w:rPr>
-      </w:pPr>
-      <w:r>
-        <w:rPr>
-          <w:rFonts w:asciiTheme="minorHAnsi" w:hAnsiTheme="minorHAnsi" w:cstheme="minorHAnsi"/>
-          <w:sz w:val="24"/>
-          <w:szCs w:val="24"/>
+          <w:sz w:val="20"/>
+          <w:szCs w:val="20"/>
+        </w:rPr>
+      </w:pPr>
+      <w:r>
+        <w:rPr>
+          <w:sz w:val="20"/>
+          <w:szCs w:val="20"/>
         </w:rPr>
         <w:t>Goal: Consolidate y = x + 4 and bridge to the graph.</w:t>
       </w:r>
@@ -2142,9 +1873,8 @@
     <w:p>
       <w:pPr>
         <w:rPr>
-          <w:rFonts w:asciiTheme="minorHAnsi" w:hAnsiTheme="minorHAnsi" w:cstheme="minorHAnsi"/>
-          <w:sz w:val="24"/>
-          <w:szCs w:val="24"/>
+          <w:sz w:val="20"/>
+          <w:szCs w:val="20"/>
         </w:rPr>
       </w:pPr>
     </w:p>
@@ -2170,12 +1900,6 @@
         <w:gridCol w:w="4680"/>
       </w:tblGrid>
       <w:tr>
-        <w:tblPrEx>
-          <w:tblCellMar>
-            <w:top w:w="0" w:type="dxa"/>
-            <w:bottom w:w="0" w:type="dxa"/>
-          </w:tblCellMar>
-        </w:tblPrEx>
         <w:tc>
           <w:tcPr>
             <w:tcW w:w="4680" w:type="dxa"/>
@@ -2196,18 +1920,16 @@
           <w:p>
             <w:pPr>
               <w:rPr>
-                <w:rFonts w:asciiTheme="minorHAnsi" w:hAnsiTheme="minorHAnsi" w:cstheme="minorHAnsi"/>
-                <w:sz w:val="24"/>
-                <w:szCs w:val="24"/>
-              </w:rPr>
-            </w:pPr>
-            <w:r>
-              <w:rPr>
-                <w:rFonts w:asciiTheme="minorHAnsi" w:hAnsiTheme="minorHAnsi" w:cstheme="minorHAnsi"/>
+                <w:sz w:val="20"/>
+                <w:szCs w:val="20"/>
+              </w:rPr>
+            </w:pPr>
+            <w:r>
+              <w:rPr>
                 <w:b/>
                 <w:bCs/>
-                <w:sz w:val="24"/>
-                <w:szCs w:val="24"/>
+                <w:sz w:val="20"/>
+                <w:szCs w:val="20"/>
               </w:rPr>
               <w:t>IDE Activity</w:t>
             </w:r>
@@ -2233,18 +1955,16 @@
           <w:p>
             <w:pPr>
               <w:rPr>
-                <w:rFonts w:asciiTheme="minorHAnsi" w:hAnsiTheme="minorHAnsi" w:cstheme="minorHAnsi"/>
-                <w:sz w:val="24"/>
-                <w:szCs w:val="24"/>
-              </w:rPr>
-            </w:pPr>
-            <w:r>
-              <w:rPr>
-                <w:rFonts w:asciiTheme="minorHAnsi" w:hAnsiTheme="minorHAnsi" w:cstheme="minorHAnsi"/>
+                <w:sz w:val="20"/>
+                <w:szCs w:val="20"/>
+              </w:rPr>
+            </w:pPr>
+            <w:r>
+              <w:rPr>
                 <w:b/>
                 <w:bCs/>
-                <w:sz w:val="24"/>
-                <w:szCs w:val="24"/>
+                <w:sz w:val="20"/>
+                <w:szCs w:val="20"/>
               </w:rPr>
               <w:t>Teacher Facilitation Notes</w:t>
             </w:r>
@@ -2252,12 +1972,6 @@
         </w:tc>
       </w:tr>
       <w:tr>
-        <w:tblPrEx>
-          <w:tblCellMar>
-            <w:top w:w="0" w:type="dxa"/>
-            <w:bottom w:w="0" w:type="dxa"/>
-          </w:tblCellMar>
-        </w:tblPrEx>
         <w:tc>
           <w:tcPr>
             <w:tcW w:w="4680" w:type="dxa"/>
@@ -2278,16 +1992,14 @@
             <w:pPr>
               <w:spacing w:before="60" w:after="60"/>
               <w:rPr>
-                <w:rFonts w:asciiTheme="minorHAnsi" w:hAnsiTheme="minorHAnsi" w:cstheme="minorHAnsi"/>
-                <w:sz w:val="24"/>
-                <w:szCs w:val="24"/>
-              </w:rPr>
-            </w:pPr>
-            <w:r>
-              <w:rPr>
-                <w:rFonts w:asciiTheme="minorHAnsi" w:hAnsiTheme="minorHAnsi" w:cstheme="minorHAnsi"/>
-                <w:sz w:val="24"/>
-                <w:szCs w:val="24"/>
+                <w:sz w:val="20"/>
+                <w:szCs w:val="20"/>
+              </w:rPr>
+            </w:pPr>
+            <w:r>
+              <w:rPr>
+                <w:sz w:val="20"/>
+                <w:szCs w:val="20"/>
               </w:rPr>
               <w:t>Task tab completion screen: ‘Ready to see this visually? Click the Desmos tab.’</w:t>
             </w:r>
@@ -2296,16 +2008,14 @@
             <w:pPr>
               <w:spacing w:before="60" w:after="60"/>
               <w:rPr>
-                <w:rFonts w:asciiTheme="minorHAnsi" w:hAnsiTheme="minorHAnsi" w:cstheme="minorHAnsi"/>
-                <w:sz w:val="24"/>
-                <w:szCs w:val="24"/>
-              </w:rPr>
-            </w:pPr>
-            <w:r>
-              <w:rPr>
-                <w:rFonts w:asciiTheme="minorHAnsi" w:hAnsiTheme="minorHAnsi" w:cstheme="minorHAnsi"/>
-                <w:sz w:val="24"/>
-                <w:szCs w:val="24"/>
+                <w:sz w:val="20"/>
+                <w:szCs w:val="20"/>
+              </w:rPr>
+            </w:pPr>
+            <w:r>
+              <w:rPr>
+                <w:sz w:val="20"/>
+                <w:szCs w:val="20"/>
               </w:rPr>
               <w:t>Desmos tab — Prediction phase: 4 calculated points listed as text</w:t>
             </w:r>
@@ -2314,16 +2024,14 @@
             <w:pPr>
               <w:spacing w:before="60" w:after="60"/>
               <w:rPr>
-                <w:rFonts w:asciiTheme="minorHAnsi" w:hAnsiTheme="minorHAnsi" w:cstheme="minorHAnsi"/>
-                <w:sz w:val="24"/>
-                <w:szCs w:val="24"/>
-              </w:rPr>
-            </w:pPr>
-            <w:r>
-              <w:rPr>
-                <w:rFonts w:asciiTheme="minorHAnsi" w:hAnsiTheme="minorHAnsi" w:cstheme="minorHAnsi"/>
-                <w:sz w:val="24"/>
-                <w:szCs w:val="24"/>
+                <w:sz w:val="20"/>
+                <w:szCs w:val="20"/>
+              </w:rPr>
+            </w:pPr>
+            <w:r>
+              <w:rPr>
+                <w:sz w:val="20"/>
+                <w:szCs w:val="20"/>
               </w:rPr>
               <w:t>Student predicts graph shape (any answer accepted, no penalty)</w:t>
             </w:r>
@@ -2349,16 +2057,14 @@
             <w:pPr>
               <w:spacing w:before="60" w:after="60"/>
               <w:rPr>
-                <w:rFonts w:asciiTheme="minorHAnsi" w:hAnsiTheme="minorHAnsi" w:cstheme="minorHAnsi"/>
-                <w:sz w:val="24"/>
-                <w:szCs w:val="24"/>
-              </w:rPr>
-            </w:pPr>
-            <w:r>
-              <w:rPr>
-                <w:rFonts w:asciiTheme="minorHAnsi" w:hAnsiTheme="minorHAnsi" w:cstheme="minorHAnsi"/>
-                <w:sz w:val="24"/>
-                <w:szCs w:val="24"/>
+                <w:sz w:val="20"/>
+                <w:szCs w:val="20"/>
+              </w:rPr>
+            </w:pPr>
+            <w:r>
+              <w:rPr>
+                <w:sz w:val="20"/>
+                <w:szCs w:val="20"/>
               </w:rPr>
               <w:t>Pause the class at the Task completion screen before students click Desmos.</w:t>
             </w:r>
@@ -2367,18 +2073,16 @@
             <w:pPr>
               <w:spacing w:before="60" w:after="60"/>
               <w:rPr>
-                <w:rFonts w:asciiTheme="minorHAnsi" w:hAnsiTheme="minorHAnsi" w:cstheme="minorHAnsi"/>
-                <w:sz w:val="24"/>
-                <w:szCs w:val="24"/>
-              </w:rPr>
-            </w:pPr>
-            <w:r>
-              <w:rPr>
-                <w:rFonts w:asciiTheme="minorHAnsi" w:hAnsiTheme="minorHAnsi" w:cstheme="minorHAnsi"/>
+                <w:sz w:val="20"/>
+                <w:szCs w:val="20"/>
+              </w:rPr>
+            </w:pPr>
+            <w:r>
+              <w:rPr>
                 <w:b/>
                 <w:bCs/>
-                <w:sz w:val="24"/>
-                <w:szCs w:val="24"/>
+                <w:sz w:val="20"/>
+                <w:szCs w:val="20"/>
               </w:rPr>
               <w:t>Ask the whole class:</w:t>
             </w:r>
@@ -2392,16 +2096,14 @@
               </w:numPr>
               <w:spacing w:before="40" w:after="40"/>
               <w:rPr>
-                <w:rFonts w:asciiTheme="minorHAnsi" w:hAnsiTheme="minorHAnsi" w:cstheme="minorHAnsi"/>
-                <w:sz w:val="24"/>
-                <w:szCs w:val="24"/>
-              </w:rPr>
-            </w:pPr>
-            <w:r>
-              <w:rPr>
-                <w:rFonts w:asciiTheme="minorHAnsi" w:hAnsiTheme="minorHAnsi" w:cstheme="minorHAnsi"/>
-                <w:sz w:val="24"/>
-                <w:szCs w:val="24"/>
+                <w:sz w:val="20"/>
+                <w:szCs w:val="20"/>
+              </w:rPr>
+            </w:pPr>
+            <w:r>
+              <w:rPr>
+                <w:sz w:val="20"/>
+                <w:szCs w:val="20"/>
               </w:rPr>
               <w:t>“We said Thamarai’s age = x + 4. We also wrote y = x + 4. What does y represent?”</w:t>
             </w:r>
@@ -2415,18 +2117,15 @@
               </w:numPr>
               <w:spacing w:before="40" w:after="40"/>
               <w:rPr>
-                <w:rFonts w:asciiTheme="minorHAnsi" w:hAnsiTheme="minorHAnsi" w:cstheme="minorHAnsi"/>
-                <w:sz w:val="24"/>
-                <w:szCs w:val="24"/>
-              </w:rPr>
-            </w:pPr>
-            <w:r>
-              <w:rPr>
-                <w:rFonts w:asciiTheme="minorHAnsi" w:hAnsiTheme="minorHAnsi" w:cstheme="minorHAnsi"/>
-                <w:sz w:val="24"/>
-                <w:szCs w:val="24"/>
-              </w:rPr>
-              <w:lastRenderedPageBreak/>
+                <w:sz w:val="20"/>
+                <w:szCs w:val="20"/>
+              </w:rPr>
+            </w:pPr>
+            <w:r>
+              <w:rPr>
+                <w:sz w:val="20"/>
+                <w:szCs w:val="20"/>
+              </w:rPr>
               <w:t>“We have four specific age pairs. What might happen if we put them on a graph?”</w:t>
             </w:r>
           </w:p>
@@ -2434,9 +2133,8 @@
             <w:pPr>
               <w:spacing w:before="60" w:after="60"/>
               <w:rPr>
-                <w:rFonts w:asciiTheme="minorHAnsi" w:hAnsiTheme="minorHAnsi" w:cstheme="minorHAnsi"/>
-                <w:sz w:val="24"/>
-                <w:szCs w:val="24"/>
+                <w:sz w:val="20"/>
+                <w:szCs w:val="20"/>
               </w:rPr>
             </w:pPr>
           </w:p>
@@ -2444,16 +2142,14 @@
             <w:pPr>
               <w:spacing w:before="60" w:after="60"/>
               <w:rPr>
-                <w:rFonts w:asciiTheme="minorHAnsi" w:hAnsiTheme="minorHAnsi" w:cstheme="minorHAnsi"/>
-                <w:sz w:val="24"/>
-                <w:szCs w:val="24"/>
-              </w:rPr>
-            </w:pPr>
-            <w:r>
-              <w:rPr>
-                <w:rFonts w:asciiTheme="minorHAnsi" w:hAnsiTheme="minorHAnsi" w:cstheme="minorHAnsi"/>
-                <w:sz w:val="24"/>
-                <w:szCs w:val="24"/>
+                <w:sz w:val="20"/>
+                <w:szCs w:val="20"/>
+              </w:rPr>
+            </w:pPr>
+            <w:r>
+              <w:rPr>
+                <w:sz w:val="20"/>
+                <w:szCs w:val="20"/>
               </w:rPr>
               <w:t>Let students write their prediction privately before selecting it in the IDE.</w:t>
             </w:r>
@@ -2464,9 +2160,8 @@
     <w:p>
       <w:pPr>
         <w:rPr>
-          <w:rFonts w:asciiTheme="minorHAnsi" w:hAnsiTheme="minorHAnsi" w:cstheme="minorHAnsi"/>
-          <w:sz w:val="24"/>
-          <w:szCs w:val="24"/>
+          <w:sz w:val="20"/>
+          <w:szCs w:val="20"/>
         </w:rPr>
       </w:pPr>
     </w:p>
@@ -2474,18 +2169,16 @@
       <w:pPr>
         <w:pStyle w:val="Heading2"/>
         <w:rPr>
-          <w:rFonts w:asciiTheme="minorHAnsi" w:hAnsiTheme="minorHAnsi" w:cstheme="minorHAnsi"/>
           <w:color w:val="auto"/>
-          <w:sz w:val="24"/>
-          <w:szCs w:val="24"/>
-        </w:rPr>
-      </w:pPr>
-      <w:r>
-        <w:rPr>
-          <w:rFonts w:asciiTheme="minorHAnsi" w:hAnsiTheme="minorHAnsi" w:cstheme="minorHAnsi"/>
+          <w:sz w:val="20"/>
+          <w:szCs w:val="20"/>
+        </w:rPr>
+      </w:pPr>
+      <w:r>
+        <w:rPr>
           <w:color w:val="auto"/>
-          <w:sz w:val="24"/>
-          <w:szCs w:val="24"/>
+          <w:sz w:val="20"/>
+          <w:szCs w:val="20"/>
         </w:rPr>
         <w:t>4. ELABORATE — 15–18 minutes</w:t>
       </w:r>
@@ -2494,44 +2187,23 @@
       <w:pPr>
         <w:spacing w:before="80" w:after="80"/>
         <w:rPr>
-          <w:rFonts w:asciiTheme="minorHAnsi" w:hAnsiTheme="minorHAnsi" w:cstheme="minorHAnsi"/>
-          <w:sz w:val="24"/>
-          <w:szCs w:val="24"/>
-        </w:rPr>
-      </w:pPr>
-      <w:r>
-        <w:rPr>
-          <w:rFonts w:asciiTheme="minorHAnsi" w:hAnsiTheme="minorHAnsi" w:cstheme="minorHAnsi"/>
-          <w:sz w:val="24"/>
-          <w:szCs w:val="24"/>
-        </w:rPr>
-        <w:t xml:space="preserve">Goal: Students explore the graph and connect the relationship to code in </w:t>
-      </w:r>
-      <w:proofErr w:type="spellStart"/>
-      <w:r>
-        <w:rPr>
-          <w:rFonts w:asciiTheme="minorHAnsi" w:hAnsiTheme="minorHAnsi" w:cstheme="minorHAnsi"/>
-          <w:sz w:val="24"/>
-          <w:szCs w:val="24"/>
-        </w:rPr>
-        <w:t>Pyret</w:t>
-      </w:r>
-      <w:proofErr w:type="spellEnd"/>
-      <w:r>
-        <w:rPr>
-          <w:rFonts w:asciiTheme="minorHAnsi" w:hAnsiTheme="minorHAnsi" w:cstheme="minorHAnsi"/>
-          <w:sz w:val="24"/>
-          <w:szCs w:val="24"/>
-        </w:rPr>
-        <w:t>.</w:t>
-      </w:r>
-    </w:p>
-    <w:p>
-      <w:pPr>
-        <w:rPr>
-          <w:rFonts w:asciiTheme="minorHAnsi" w:hAnsiTheme="minorHAnsi" w:cstheme="minorHAnsi"/>
-          <w:sz w:val="24"/>
-          <w:szCs w:val="24"/>
+          <w:sz w:val="20"/>
+          <w:szCs w:val="20"/>
+        </w:rPr>
+      </w:pPr>
+      <w:r>
+        <w:rPr>
+          <w:sz w:val="20"/>
+          <w:szCs w:val="20"/>
+        </w:rPr>
+        <w:t>Goal: Students explore the graph and connect the relationship to code in Pyret.</w:t>
+      </w:r>
+    </w:p>
+    <w:p>
+      <w:pPr>
+        <w:rPr>
+          <w:sz w:val="20"/>
+          <w:szCs w:val="20"/>
         </w:rPr>
       </w:pPr>
     </w:p>
@@ -2557,12 +2229,6 @@
         <w:gridCol w:w="4680"/>
       </w:tblGrid>
       <w:tr>
-        <w:tblPrEx>
-          <w:tblCellMar>
-            <w:top w:w="0" w:type="dxa"/>
-            <w:bottom w:w="0" w:type="dxa"/>
-          </w:tblCellMar>
-        </w:tblPrEx>
         <w:tc>
           <w:tcPr>
             <w:tcW w:w="4680" w:type="dxa"/>
@@ -2583,18 +2249,16 @@
           <w:p>
             <w:pPr>
               <w:rPr>
-                <w:rFonts w:asciiTheme="minorHAnsi" w:hAnsiTheme="minorHAnsi" w:cstheme="minorHAnsi"/>
-                <w:sz w:val="24"/>
-                <w:szCs w:val="24"/>
-              </w:rPr>
-            </w:pPr>
-            <w:r>
-              <w:rPr>
-                <w:rFonts w:asciiTheme="minorHAnsi" w:hAnsiTheme="minorHAnsi" w:cstheme="minorHAnsi"/>
+                <w:sz w:val="20"/>
+                <w:szCs w:val="20"/>
+              </w:rPr>
+            </w:pPr>
+            <w:r>
+              <w:rPr>
                 <w:b/>
                 <w:bCs/>
-                <w:sz w:val="24"/>
-                <w:szCs w:val="24"/>
+                <w:sz w:val="20"/>
+                <w:szCs w:val="20"/>
               </w:rPr>
               <w:t>IDE Activity</w:t>
             </w:r>
@@ -2620,18 +2284,16 @@
           <w:p>
             <w:pPr>
               <w:rPr>
-                <w:rFonts w:asciiTheme="minorHAnsi" w:hAnsiTheme="minorHAnsi" w:cstheme="minorHAnsi"/>
-                <w:sz w:val="24"/>
-                <w:szCs w:val="24"/>
-              </w:rPr>
-            </w:pPr>
-            <w:r>
-              <w:rPr>
-                <w:rFonts w:asciiTheme="minorHAnsi" w:hAnsiTheme="minorHAnsi" w:cstheme="minorHAnsi"/>
+                <w:sz w:val="20"/>
+                <w:szCs w:val="20"/>
+              </w:rPr>
+            </w:pPr>
+            <w:r>
+              <w:rPr>
                 <w:b/>
                 <w:bCs/>
-                <w:sz w:val="24"/>
-                <w:szCs w:val="24"/>
+                <w:sz w:val="20"/>
+                <w:szCs w:val="20"/>
               </w:rPr>
               <w:t>Teacher Facilitation Notes</w:t>
             </w:r>
@@ -2639,12 +2301,6 @@
         </w:tc>
       </w:tr>
       <w:tr>
-        <w:tblPrEx>
-          <w:tblCellMar>
-            <w:top w:w="0" w:type="dxa"/>
-            <w:bottom w:w="0" w:type="dxa"/>
-          </w:tblCellMar>
-        </w:tblPrEx>
         <w:tc>
           <w:tcPr>
             <w:tcW w:w="4680" w:type="dxa"/>
@@ -2665,16 +2321,14 @@
             <w:pPr>
               <w:spacing w:before="60" w:after="60"/>
               <w:rPr>
-                <w:rFonts w:asciiTheme="minorHAnsi" w:hAnsiTheme="minorHAnsi" w:cstheme="minorHAnsi"/>
-                <w:sz w:val="24"/>
-                <w:szCs w:val="24"/>
-              </w:rPr>
-            </w:pPr>
-            <w:r>
-              <w:rPr>
-                <w:rFonts w:asciiTheme="minorHAnsi" w:hAnsiTheme="minorHAnsi" w:cstheme="minorHAnsi"/>
-                <w:sz w:val="24"/>
-                <w:szCs w:val="24"/>
+                <w:sz w:val="20"/>
+                <w:szCs w:val="20"/>
+              </w:rPr>
+            </w:pPr>
+            <w:r>
+              <w:rPr>
+                <w:sz w:val="20"/>
+                <w:szCs w:val="20"/>
               </w:rPr>
               <w:t>Desmos tab — Graph phase:</w:t>
             </w:r>
@@ -2688,16 +2342,14 @@
               </w:numPr>
               <w:spacing w:before="40" w:after="40"/>
               <w:rPr>
-                <w:rFonts w:asciiTheme="minorHAnsi" w:hAnsiTheme="minorHAnsi" w:cstheme="minorHAnsi"/>
-                <w:sz w:val="24"/>
-                <w:szCs w:val="24"/>
-              </w:rPr>
-            </w:pPr>
-            <w:r>
-              <w:rPr>
-                <w:rFonts w:asciiTheme="minorHAnsi" w:hAnsiTheme="minorHAnsi" w:cstheme="minorHAnsi"/>
-                <w:sz w:val="24"/>
-                <w:szCs w:val="24"/>
+                <w:sz w:val="20"/>
+                <w:szCs w:val="20"/>
+              </w:rPr>
+            </w:pPr>
+            <w:r>
+              <w:rPr>
+                <w:sz w:val="20"/>
+                <w:szCs w:val="20"/>
               </w:rPr>
               <w:t>Full graph reveals: 4 blue points + red line y = x + 4</w:t>
             </w:r>
@@ -2711,16 +2363,14 @@
               </w:numPr>
               <w:spacing w:before="40" w:after="40"/>
               <w:rPr>
-                <w:rFonts w:asciiTheme="minorHAnsi" w:hAnsiTheme="minorHAnsi" w:cstheme="minorHAnsi"/>
-                <w:sz w:val="24"/>
-                <w:szCs w:val="24"/>
-              </w:rPr>
-            </w:pPr>
-            <w:r>
-              <w:rPr>
-                <w:rFonts w:asciiTheme="minorHAnsi" w:hAnsiTheme="minorHAnsi" w:cstheme="minorHAnsi"/>
-                <w:sz w:val="24"/>
-                <w:szCs w:val="24"/>
+                <w:sz w:val="20"/>
+                <w:szCs w:val="20"/>
+              </w:rPr>
+            </w:pPr>
+            <w:r>
+              <w:rPr>
+                <w:sz w:val="20"/>
+                <w:szCs w:val="20"/>
               </w:rPr>
               <w:t>Student’s prediction is referenced: ‘You predicted X — does the graph match?’</w:t>
             </w:r>
@@ -2734,16 +2384,14 @@
               </w:numPr>
               <w:spacing w:before="40" w:after="40"/>
               <w:rPr>
-                <w:rFonts w:asciiTheme="minorHAnsi" w:hAnsiTheme="minorHAnsi" w:cstheme="minorHAnsi"/>
-                <w:sz w:val="24"/>
-                <w:szCs w:val="24"/>
-              </w:rPr>
-            </w:pPr>
-            <w:r>
-              <w:rPr>
-                <w:rFonts w:asciiTheme="minorHAnsi" w:hAnsiTheme="minorHAnsi" w:cstheme="minorHAnsi"/>
-                <w:sz w:val="24"/>
-                <w:szCs w:val="24"/>
+                <w:sz w:val="20"/>
+                <w:szCs w:val="20"/>
+              </w:rPr>
+            </w:pPr>
+            <w:r>
+              <w:rPr>
+                <w:sz w:val="20"/>
+                <w:szCs w:val="20"/>
               </w:rPr>
               <w:t>Comprehension question: ‘What happens to Thamarai’s age as Selvi’s age increases?’ (radio: Increases / Decreases / Stays the same)</w:t>
             </w:r>
@@ -2752,9 +2400,8 @@
             <w:pPr>
               <w:spacing w:before="60" w:after="60"/>
               <w:rPr>
-                <w:rFonts w:asciiTheme="minorHAnsi" w:hAnsiTheme="minorHAnsi" w:cstheme="minorHAnsi"/>
-                <w:sz w:val="24"/>
-                <w:szCs w:val="24"/>
+                <w:sz w:val="20"/>
+                <w:szCs w:val="20"/>
               </w:rPr>
             </w:pPr>
           </w:p>
@@ -2762,28 +2409,16 @@
             <w:pPr>
               <w:spacing w:before="60" w:after="60"/>
               <w:rPr>
-                <w:rFonts w:asciiTheme="minorHAnsi" w:hAnsiTheme="minorHAnsi" w:cstheme="minorHAnsi"/>
-                <w:sz w:val="24"/>
-                <w:szCs w:val="24"/>
-              </w:rPr>
-            </w:pPr>
-            <w:proofErr w:type="spellStart"/>
-            <w:r>
-              <w:rPr>
-                <w:rFonts w:asciiTheme="minorHAnsi" w:hAnsiTheme="minorHAnsi" w:cstheme="minorHAnsi"/>
-                <w:sz w:val="24"/>
-                <w:szCs w:val="24"/>
-              </w:rPr>
-              <w:t>Pyret</w:t>
-            </w:r>
-            <w:proofErr w:type="spellEnd"/>
-            <w:r>
-              <w:rPr>
-                <w:rFonts w:asciiTheme="minorHAnsi" w:hAnsiTheme="minorHAnsi" w:cstheme="minorHAnsi"/>
-                <w:sz w:val="24"/>
-                <w:szCs w:val="24"/>
-              </w:rPr>
-              <w:t xml:space="preserve"> tab:</w:t>
+                <w:sz w:val="20"/>
+                <w:szCs w:val="20"/>
+              </w:rPr>
+            </w:pPr>
+            <w:r>
+              <w:rPr>
+                <w:sz w:val="20"/>
+                <w:szCs w:val="20"/>
+              </w:rPr>
+              <w:t>Pyret tab:</w:t>
             </w:r>
           </w:p>
           <w:p>
@@ -2795,16 +2430,14 @@
               </w:numPr>
               <w:spacing w:before="40" w:after="40"/>
               <w:rPr>
-                <w:rFonts w:asciiTheme="minorHAnsi" w:hAnsiTheme="minorHAnsi" w:cstheme="minorHAnsi"/>
-                <w:sz w:val="24"/>
-                <w:szCs w:val="24"/>
-              </w:rPr>
-            </w:pPr>
-            <w:r>
-              <w:rPr>
-                <w:rFonts w:asciiTheme="minorHAnsi" w:hAnsiTheme="minorHAnsi" w:cstheme="minorHAnsi"/>
-                <w:sz w:val="24"/>
-                <w:szCs w:val="24"/>
+                <w:sz w:val="20"/>
+                <w:szCs w:val="20"/>
+              </w:rPr>
+            </w:pPr>
+            <w:r>
+              <w:rPr>
+                <w:sz w:val="20"/>
+                <w:szCs w:val="20"/>
               </w:rPr>
               <w:t>Code explanation panel: each line annotated in plain English</w:t>
             </w:r>
@@ -2818,16 +2451,14 @@
               </w:numPr>
               <w:spacing w:before="40" w:after="40"/>
               <w:rPr>
-                <w:rFonts w:asciiTheme="minorHAnsi" w:hAnsiTheme="minorHAnsi" w:cstheme="minorHAnsi"/>
-                <w:sz w:val="24"/>
-                <w:szCs w:val="24"/>
-              </w:rPr>
-            </w:pPr>
-            <w:r>
-              <w:rPr>
-                <w:rFonts w:asciiTheme="minorHAnsi" w:hAnsiTheme="minorHAnsi" w:cstheme="minorHAnsi"/>
-                <w:sz w:val="24"/>
-                <w:szCs w:val="24"/>
+                <w:sz w:val="20"/>
+                <w:szCs w:val="20"/>
+              </w:rPr>
+            </w:pPr>
+            <w:r>
+              <w:rPr>
+                <w:sz w:val="20"/>
+                <w:szCs w:val="20"/>
               </w:rPr>
               <w:t>Try-it panel: student enters any age, sees result instantly</w:t>
             </w:r>
@@ -2853,18 +2484,16 @@
             <w:pPr>
               <w:spacing w:before="60" w:after="60"/>
               <w:rPr>
-                <w:rFonts w:asciiTheme="minorHAnsi" w:hAnsiTheme="minorHAnsi" w:cstheme="minorHAnsi"/>
-                <w:sz w:val="24"/>
-                <w:szCs w:val="24"/>
-              </w:rPr>
-            </w:pPr>
-            <w:r>
-              <w:rPr>
-                <w:rFonts w:asciiTheme="minorHAnsi" w:hAnsiTheme="minorHAnsi" w:cstheme="minorHAnsi"/>
+                <w:sz w:val="20"/>
+                <w:szCs w:val="20"/>
+              </w:rPr>
+            </w:pPr>
+            <w:r>
+              <w:rPr>
                 <w:b/>
                 <w:bCs/>
-                <w:sz w:val="24"/>
-                <w:szCs w:val="24"/>
+                <w:sz w:val="20"/>
+                <w:szCs w:val="20"/>
               </w:rPr>
               <w:t>At the Desmos graph, ask:</w:t>
             </w:r>
@@ -2878,16 +2507,14 @@
               </w:numPr>
               <w:spacing w:before="40" w:after="40"/>
               <w:rPr>
-                <w:rFonts w:asciiTheme="minorHAnsi" w:hAnsiTheme="minorHAnsi" w:cstheme="minorHAnsi"/>
-                <w:sz w:val="24"/>
-                <w:szCs w:val="24"/>
-              </w:rPr>
-            </w:pPr>
-            <w:r>
-              <w:rPr>
-                <w:rFonts w:asciiTheme="minorHAnsi" w:hAnsiTheme="minorHAnsi" w:cstheme="minorHAnsi"/>
-                <w:sz w:val="24"/>
-                <w:szCs w:val="24"/>
+                <w:sz w:val="20"/>
+                <w:szCs w:val="20"/>
+              </w:rPr>
+            </w:pPr>
+            <w:r>
+              <w:rPr>
+                <w:sz w:val="20"/>
+                <w:szCs w:val="20"/>
               </w:rPr>
               <w:t>Can you find all four blue points? Are they on the red line?</w:t>
             </w:r>
@@ -2901,32 +2528,28 @@
               </w:numPr>
               <w:spacing w:before="40" w:after="40"/>
               <w:rPr>
-                <w:rFonts w:asciiTheme="minorHAnsi" w:hAnsiTheme="minorHAnsi" w:cstheme="minorHAnsi"/>
-                <w:sz w:val="24"/>
-                <w:szCs w:val="24"/>
-              </w:rPr>
-            </w:pPr>
-            <w:r>
-              <w:rPr>
-                <w:rFonts w:asciiTheme="minorHAnsi" w:hAnsiTheme="minorHAnsi" w:cstheme="minorHAnsi"/>
-                <w:sz w:val="24"/>
-                <w:szCs w:val="24"/>
+                <w:sz w:val="20"/>
+                <w:szCs w:val="20"/>
+              </w:rPr>
+            </w:pPr>
+            <w:r>
+              <w:rPr>
+                <w:sz w:val="20"/>
+                <w:szCs w:val="20"/>
               </w:rPr>
               <w:t xml:space="preserve">Was your </w:t>
             </w:r>
             <w:r>
               <w:rPr>
-                <w:rFonts w:asciiTheme="minorHAnsi" w:hAnsiTheme="minorHAnsi" w:cstheme="minorHAnsi"/>
-                <w:sz w:val="24"/>
-                <w:szCs w:val="24"/>
+                <w:sz w:val="20"/>
+                <w:szCs w:val="20"/>
               </w:rPr>
               <w:t>prediction,</w:t>
             </w:r>
             <w:r>
               <w:rPr>
-                <w:rFonts w:asciiTheme="minorHAnsi" w:hAnsiTheme="minorHAnsi" w:cstheme="minorHAnsi"/>
-                <w:sz w:val="24"/>
-                <w:szCs w:val="24"/>
+                <w:sz w:val="20"/>
+                <w:szCs w:val="20"/>
               </w:rPr>
               <w:t xml:space="preserve"> right? What do you notice?</w:t>
             </w:r>
@@ -2935,9 +2558,8 @@
             <w:pPr>
               <w:spacing w:before="60" w:after="60"/>
               <w:rPr>
-                <w:rFonts w:asciiTheme="minorHAnsi" w:hAnsiTheme="minorHAnsi" w:cstheme="minorHAnsi"/>
-                <w:sz w:val="24"/>
-                <w:szCs w:val="24"/>
+                <w:sz w:val="20"/>
+                <w:szCs w:val="20"/>
               </w:rPr>
             </w:pPr>
           </w:p>
@@ -2945,11 +2567,10 @@
             <w:pPr>
               <w:spacing w:before="60" w:after="60"/>
               <w:rPr>
-                <w:rFonts w:asciiTheme="minorHAnsi" w:hAnsiTheme="minorHAnsi" w:cstheme="minorHAnsi"/>
                 <w:b/>
                 <w:bCs/>
-                <w:sz w:val="24"/>
-                <w:szCs w:val="24"/>
+                <w:sz w:val="20"/>
+                <w:szCs w:val="20"/>
               </w:rPr>
             </w:pPr>
           </w:p>
@@ -2957,11 +2578,10 @@
             <w:pPr>
               <w:spacing w:before="60" w:after="60"/>
               <w:rPr>
-                <w:rFonts w:asciiTheme="minorHAnsi" w:hAnsiTheme="minorHAnsi" w:cstheme="minorHAnsi"/>
                 <w:b/>
                 <w:bCs/>
-                <w:sz w:val="24"/>
-                <w:szCs w:val="24"/>
+                <w:sz w:val="20"/>
+                <w:szCs w:val="20"/>
               </w:rPr>
             </w:pPr>
           </w:p>
@@ -2969,11 +2589,10 @@
             <w:pPr>
               <w:spacing w:before="60" w:after="60"/>
               <w:rPr>
-                <w:rFonts w:asciiTheme="minorHAnsi" w:hAnsiTheme="minorHAnsi" w:cstheme="minorHAnsi"/>
                 <w:b/>
                 <w:bCs/>
-                <w:sz w:val="24"/>
-                <w:szCs w:val="24"/>
+                <w:sz w:val="20"/>
+                <w:szCs w:val="20"/>
               </w:rPr>
             </w:pPr>
           </w:p>
@@ -2981,11 +2600,10 @@
             <w:pPr>
               <w:spacing w:before="60" w:after="60"/>
               <w:rPr>
-                <w:rFonts w:asciiTheme="minorHAnsi" w:hAnsiTheme="minorHAnsi" w:cstheme="minorHAnsi"/>
                 <w:b/>
                 <w:bCs/>
-                <w:sz w:val="24"/>
-                <w:szCs w:val="24"/>
+                <w:sz w:val="20"/>
+                <w:szCs w:val="20"/>
               </w:rPr>
             </w:pPr>
           </w:p>
@@ -2993,42 +2611,18 @@
             <w:pPr>
               <w:spacing w:before="60" w:after="60"/>
               <w:rPr>
-                <w:rFonts w:asciiTheme="minorHAnsi" w:hAnsiTheme="minorHAnsi" w:cstheme="minorHAnsi"/>
-                <w:sz w:val="24"/>
-                <w:szCs w:val="24"/>
-              </w:rPr>
-            </w:pPr>
-            <w:r>
-              <w:rPr>
-                <w:rFonts w:asciiTheme="minorHAnsi" w:hAnsiTheme="minorHAnsi" w:cstheme="minorHAnsi"/>
+                <w:sz w:val="20"/>
+                <w:szCs w:val="20"/>
+              </w:rPr>
+            </w:pPr>
+            <w:r>
+              <w:rPr>
                 <w:b/>
                 <w:bCs/>
-                <w:sz w:val="24"/>
-                <w:szCs w:val="24"/>
-              </w:rPr>
-              <w:t xml:space="preserve">At the </w:t>
-            </w:r>
-            <w:proofErr w:type="spellStart"/>
-            <w:r>
-              <w:rPr>
-                <w:rFonts w:asciiTheme="minorHAnsi" w:hAnsiTheme="minorHAnsi" w:cstheme="minorHAnsi"/>
-                <w:b/>
-                <w:bCs/>
-                <w:sz w:val="24"/>
-                <w:szCs w:val="24"/>
-              </w:rPr>
-              <w:t>Pyret</w:t>
-            </w:r>
-            <w:proofErr w:type="spellEnd"/>
-            <w:r>
-              <w:rPr>
-                <w:rFonts w:asciiTheme="minorHAnsi" w:hAnsiTheme="minorHAnsi" w:cstheme="minorHAnsi"/>
-                <w:b/>
-                <w:bCs/>
-                <w:sz w:val="24"/>
-                <w:szCs w:val="24"/>
-              </w:rPr>
-              <w:t xml:space="preserve"> tab, model reading the code aloud before students try it:</w:t>
+                <w:sz w:val="20"/>
+                <w:szCs w:val="20"/>
+              </w:rPr>
+              <w:t>At the Pyret tab, model reading the code aloud before students try it:</w:t>
             </w:r>
           </w:p>
           <w:p>
@@ -3040,72 +2634,16 @@
               </w:numPr>
               <w:spacing w:before="40" w:after="40"/>
               <w:rPr>
-                <w:rFonts w:asciiTheme="minorHAnsi" w:hAnsiTheme="minorHAnsi" w:cstheme="minorHAnsi"/>
-                <w:sz w:val="24"/>
-                <w:szCs w:val="24"/>
-              </w:rPr>
-            </w:pPr>
-            <w:r>
-              <w:rPr>
-                <w:rFonts w:asciiTheme="minorHAnsi" w:hAnsiTheme="minorHAnsi" w:cstheme="minorHAnsi"/>
-                <w:sz w:val="24"/>
-                <w:szCs w:val="24"/>
-              </w:rPr>
-              <w:t>“</w:t>
-            </w:r>
-            <w:proofErr w:type="gramStart"/>
-            <w:r>
-              <w:rPr>
-                <w:rFonts w:asciiTheme="minorHAnsi" w:hAnsiTheme="minorHAnsi" w:cstheme="minorHAnsi"/>
-                <w:sz w:val="24"/>
-                <w:szCs w:val="24"/>
-              </w:rPr>
-              <w:t>fun</w:t>
-            </w:r>
-            <w:proofErr w:type="gramEnd"/>
-            <w:r>
-              <w:rPr>
-                <w:rFonts w:asciiTheme="minorHAnsi" w:hAnsiTheme="minorHAnsi" w:cstheme="minorHAnsi"/>
-                <w:sz w:val="24"/>
-                <w:szCs w:val="24"/>
-              </w:rPr>
-              <w:t xml:space="preserve"> </w:t>
-            </w:r>
-            <w:proofErr w:type="spellStart"/>
-            <w:r>
-              <w:rPr>
-                <w:rFonts w:asciiTheme="minorHAnsi" w:hAnsiTheme="minorHAnsi" w:cstheme="minorHAnsi"/>
-                <w:sz w:val="24"/>
-                <w:szCs w:val="24"/>
-              </w:rPr>
-              <w:t>thamarai</w:t>
-            </w:r>
-            <w:proofErr w:type="spellEnd"/>
-            <w:r>
-              <w:rPr>
-                <w:rFonts w:asciiTheme="minorHAnsi" w:hAnsiTheme="minorHAnsi" w:cstheme="minorHAnsi"/>
-                <w:sz w:val="24"/>
-                <w:szCs w:val="24"/>
-              </w:rPr>
-              <w:t>-age(</w:t>
-            </w:r>
-            <w:proofErr w:type="spellStart"/>
-            <w:r>
-              <w:rPr>
-                <w:rFonts w:asciiTheme="minorHAnsi" w:hAnsiTheme="minorHAnsi" w:cstheme="minorHAnsi"/>
-                <w:sz w:val="24"/>
-                <w:szCs w:val="24"/>
-              </w:rPr>
-              <w:t>selvi</w:t>
-            </w:r>
-            <w:proofErr w:type="spellEnd"/>
-            <w:r>
-              <w:rPr>
-                <w:rFonts w:asciiTheme="minorHAnsi" w:hAnsiTheme="minorHAnsi" w:cstheme="minorHAnsi"/>
-                <w:sz w:val="24"/>
-                <w:szCs w:val="24"/>
-              </w:rPr>
-              <w:t>-age): means ‘define a rule that takes Selvi’s age as input’.”</w:t>
+                <w:sz w:val="20"/>
+                <w:szCs w:val="20"/>
+              </w:rPr>
+            </w:pPr>
+            <w:r>
+              <w:rPr>
+                <w:sz w:val="20"/>
+                <w:szCs w:val="20"/>
+              </w:rPr>
+              <w:t>“fun thamarai-age(selvi-age): means ‘define a rule that takes Selvi’s age as input’.”</w:t>
             </w:r>
           </w:p>
           <w:p>
@@ -3117,17 +2655,16 @@
               </w:numPr>
               <w:spacing w:before="40" w:after="40"/>
               <w:rPr>
-                <w:rFonts w:asciiTheme="minorHAnsi" w:hAnsiTheme="minorHAnsi" w:cstheme="minorHAnsi"/>
-                <w:sz w:val="24"/>
-                <w:szCs w:val="24"/>
-              </w:rPr>
-            </w:pPr>
-            <w:r>
-              <w:rPr>
-                <w:rFonts w:asciiTheme="minorHAnsi" w:hAnsiTheme="minorHAnsi" w:cstheme="minorHAnsi"/>
-                <w:sz w:val="24"/>
-                <w:szCs w:val="24"/>
-              </w:rPr>
+                <w:sz w:val="20"/>
+                <w:szCs w:val="20"/>
+              </w:rPr>
+            </w:pPr>
+            <w:r>
+              <w:rPr>
+                <w:sz w:val="20"/>
+                <w:szCs w:val="20"/>
+              </w:rPr>
+              <w:lastRenderedPageBreak/>
               <w:t>Ask: “Where do you see x + 4 in the code?”</w:t>
             </w:r>
           </w:p>
@@ -3138,19 +2675,18 @@
       <w:pPr>
         <w:pStyle w:val="Heading2"/>
         <w:rPr>
-          <w:rFonts w:asciiTheme="minorHAnsi" w:hAnsiTheme="minorHAnsi" w:cstheme="minorHAnsi"/>
           <w:color w:val="auto"/>
-          <w:sz w:val="24"/>
-          <w:szCs w:val="24"/>
-        </w:rPr>
-      </w:pPr>
-      <w:r>
-        <w:rPr>
-          <w:rFonts w:asciiTheme="minorHAnsi" w:hAnsiTheme="minorHAnsi" w:cstheme="minorHAnsi"/>
+          <w:sz w:val="20"/>
+          <w:szCs w:val="20"/>
+        </w:rPr>
+      </w:pPr>
+      <w:r>
+        <w:rPr>
           <w:color w:val="auto"/>
-          <w:sz w:val="24"/>
-          <w:szCs w:val="24"/>
-        </w:rPr>
+          <w:sz w:val="20"/>
+          <w:szCs w:val="20"/>
+        </w:rPr>
+        <w:lastRenderedPageBreak/>
         <w:t>5. EVALUATE — 8–10 minutes</w:t>
       </w:r>
     </w:p>
@@ -3158,16 +2694,14 @@
       <w:pPr>
         <w:spacing w:before="80" w:after="80"/>
         <w:rPr>
-          <w:rFonts w:asciiTheme="minorHAnsi" w:hAnsiTheme="minorHAnsi" w:cstheme="minorHAnsi"/>
-          <w:sz w:val="24"/>
-          <w:szCs w:val="24"/>
-        </w:rPr>
-      </w:pPr>
-      <w:r>
-        <w:rPr>
-          <w:rFonts w:asciiTheme="minorHAnsi" w:hAnsiTheme="minorHAnsi" w:cstheme="minorHAnsi"/>
-          <w:sz w:val="24"/>
-          <w:szCs w:val="24"/>
+          <w:sz w:val="20"/>
+          <w:szCs w:val="20"/>
+        </w:rPr>
+      </w:pPr>
+      <w:r>
+        <w:rPr>
+          <w:sz w:val="20"/>
+          <w:szCs w:val="20"/>
         </w:rPr>
         <w:t>Goal: Students synthesise their understanding across all three representations.</w:t>
       </w:r>
@@ -3175,9 +2709,8 @@
     <w:p>
       <w:pPr>
         <w:rPr>
-          <w:rFonts w:asciiTheme="minorHAnsi" w:hAnsiTheme="minorHAnsi" w:cstheme="minorHAnsi"/>
-          <w:sz w:val="24"/>
-          <w:szCs w:val="24"/>
+          <w:sz w:val="20"/>
+          <w:szCs w:val="20"/>
         </w:rPr>
       </w:pPr>
     </w:p>
@@ -3203,12 +2736,6 @@
         <w:gridCol w:w="4680"/>
       </w:tblGrid>
       <w:tr>
-        <w:tblPrEx>
-          <w:tblCellMar>
-            <w:top w:w="0" w:type="dxa"/>
-            <w:bottom w:w="0" w:type="dxa"/>
-          </w:tblCellMar>
-        </w:tblPrEx>
         <w:tc>
           <w:tcPr>
             <w:tcW w:w="4680" w:type="dxa"/>
@@ -3229,18 +2756,16 @@
           <w:p>
             <w:pPr>
               <w:rPr>
-                <w:rFonts w:asciiTheme="minorHAnsi" w:hAnsiTheme="minorHAnsi" w:cstheme="minorHAnsi"/>
-                <w:sz w:val="24"/>
-                <w:szCs w:val="24"/>
-              </w:rPr>
-            </w:pPr>
-            <w:r>
-              <w:rPr>
-                <w:rFonts w:asciiTheme="minorHAnsi" w:hAnsiTheme="minorHAnsi" w:cstheme="minorHAnsi"/>
+                <w:sz w:val="20"/>
+                <w:szCs w:val="20"/>
+              </w:rPr>
+            </w:pPr>
+            <w:r>
+              <w:rPr>
                 <w:b/>
                 <w:bCs/>
-                <w:sz w:val="24"/>
-                <w:szCs w:val="24"/>
+                <w:sz w:val="20"/>
+                <w:szCs w:val="20"/>
               </w:rPr>
               <w:t>IDE Activity</w:t>
             </w:r>
@@ -3266,18 +2791,16 @@
           <w:p>
             <w:pPr>
               <w:rPr>
-                <w:rFonts w:asciiTheme="minorHAnsi" w:hAnsiTheme="minorHAnsi" w:cstheme="minorHAnsi"/>
-                <w:sz w:val="24"/>
-                <w:szCs w:val="24"/>
-              </w:rPr>
-            </w:pPr>
-            <w:r>
-              <w:rPr>
-                <w:rFonts w:asciiTheme="minorHAnsi" w:hAnsiTheme="minorHAnsi" w:cstheme="minorHAnsi"/>
+                <w:sz w:val="20"/>
+                <w:szCs w:val="20"/>
+              </w:rPr>
+            </w:pPr>
+            <w:r>
+              <w:rPr>
                 <w:b/>
                 <w:bCs/>
-                <w:sz w:val="24"/>
-                <w:szCs w:val="24"/>
+                <w:sz w:val="20"/>
+                <w:szCs w:val="20"/>
               </w:rPr>
               <w:t>Teacher Facilitation Notes</w:t>
             </w:r>
@@ -3285,12 +2808,6 @@
         </w:tc>
       </w:tr>
       <w:tr>
-        <w:tblPrEx>
-          <w:tblCellMar>
-            <w:top w:w="0" w:type="dxa"/>
-            <w:bottom w:w="0" w:type="dxa"/>
-          </w:tblCellMar>
-        </w:tblPrEx>
         <w:tc>
           <w:tcPr>
             <w:tcW w:w="4680" w:type="dxa"/>
@@ -3311,16 +2828,14 @@
             <w:pPr>
               <w:spacing w:before="60" w:after="60"/>
               <w:rPr>
-                <w:rFonts w:asciiTheme="minorHAnsi" w:hAnsiTheme="minorHAnsi" w:cstheme="minorHAnsi"/>
-                <w:sz w:val="24"/>
-                <w:szCs w:val="24"/>
-              </w:rPr>
-            </w:pPr>
-            <w:r>
-              <w:rPr>
-                <w:rFonts w:asciiTheme="minorHAnsi" w:hAnsiTheme="minorHAnsi" w:cstheme="minorHAnsi"/>
-                <w:sz w:val="24"/>
-                <w:szCs w:val="24"/>
+                <w:sz w:val="20"/>
+                <w:szCs w:val="20"/>
+              </w:rPr>
+            </w:pPr>
+            <w:r>
+              <w:rPr>
+                <w:sz w:val="20"/>
+                <w:szCs w:val="20"/>
               </w:rPr>
               <w:t>Check tab — 3 reflection questions:</w:t>
             </w:r>
@@ -3334,18 +2849,15 @@
               </w:numPr>
               <w:spacing w:before="40" w:after="40"/>
               <w:rPr>
-                <w:rFonts w:asciiTheme="minorHAnsi" w:hAnsiTheme="minorHAnsi" w:cstheme="minorHAnsi"/>
-                <w:sz w:val="24"/>
-                <w:szCs w:val="24"/>
-              </w:rPr>
-            </w:pPr>
-            <w:r>
-              <w:rPr>
-                <w:rFonts w:asciiTheme="minorHAnsi" w:hAnsiTheme="minorHAnsi" w:cstheme="minorHAnsi"/>
-                <w:sz w:val="24"/>
-                <w:szCs w:val="24"/>
-              </w:rPr>
-              <w:lastRenderedPageBreak/>
+                <w:sz w:val="20"/>
+                <w:szCs w:val="20"/>
+              </w:rPr>
+            </w:pPr>
+            <w:r>
+              <w:rPr>
+                <w:sz w:val="20"/>
+                <w:szCs w:val="20"/>
+              </w:rPr>
               <w:t>Q1: Do all three representations show the same relationship? Explain.</w:t>
             </w:r>
           </w:p>
@@ -3358,16 +2870,14 @@
               </w:numPr>
               <w:spacing w:before="40" w:after="40"/>
               <w:rPr>
-                <w:rFonts w:asciiTheme="minorHAnsi" w:hAnsiTheme="minorHAnsi" w:cstheme="minorHAnsi"/>
-                <w:sz w:val="24"/>
-                <w:szCs w:val="24"/>
-              </w:rPr>
-            </w:pPr>
-            <w:r>
-              <w:rPr>
-                <w:rFonts w:asciiTheme="minorHAnsi" w:hAnsiTheme="minorHAnsi" w:cstheme="minorHAnsi"/>
-                <w:sz w:val="24"/>
-                <w:szCs w:val="24"/>
+                <w:sz w:val="20"/>
+                <w:szCs w:val="20"/>
+              </w:rPr>
+            </w:pPr>
+            <w:r>
+              <w:rPr>
+                <w:sz w:val="20"/>
+                <w:szCs w:val="20"/>
               </w:rPr>
               <w:t>Q2: Which representation helped you understand best? Why?</w:t>
             </w:r>
@@ -3381,16 +2891,14 @@
               </w:numPr>
               <w:spacing w:before="40" w:after="40"/>
               <w:rPr>
-                <w:rFonts w:asciiTheme="minorHAnsi" w:hAnsiTheme="minorHAnsi" w:cstheme="minorHAnsi"/>
-                <w:sz w:val="24"/>
-                <w:szCs w:val="24"/>
-              </w:rPr>
-            </w:pPr>
-            <w:r>
-              <w:rPr>
-                <w:rFonts w:asciiTheme="minorHAnsi" w:hAnsiTheme="minorHAnsi" w:cstheme="minorHAnsi"/>
-                <w:sz w:val="24"/>
-                <w:szCs w:val="24"/>
+                <w:sz w:val="20"/>
+                <w:szCs w:val="20"/>
+              </w:rPr>
+            </w:pPr>
+            <w:r>
+              <w:rPr>
+                <w:sz w:val="20"/>
+                <w:szCs w:val="20"/>
               </w:rPr>
               <w:t>Q3: Can you think of another real-life situation modelled by x + 4?</w:t>
             </w:r>
@@ -3416,59 +2924,52 @@
             <w:pPr>
               <w:spacing w:before="60" w:after="60"/>
               <w:rPr>
-                <w:rFonts w:asciiTheme="minorHAnsi" w:hAnsiTheme="minorHAnsi" w:cstheme="minorHAnsi"/>
-                <w:sz w:val="24"/>
-                <w:szCs w:val="24"/>
-              </w:rPr>
-            </w:pPr>
-            <w:r>
-              <w:rPr>
-                <w:rFonts w:asciiTheme="minorHAnsi" w:hAnsiTheme="minorHAnsi" w:cstheme="minorHAnsi"/>
+                <w:sz w:val="20"/>
+                <w:szCs w:val="20"/>
+              </w:rPr>
+            </w:pPr>
+            <w:r>
+              <w:rPr>
                 <w:b/>
                 <w:bCs/>
-                <w:sz w:val="24"/>
-                <w:szCs w:val="24"/>
-              </w:rPr>
-              <w:lastRenderedPageBreak/>
+                <w:sz w:val="20"/>
+                <w:szCs w:val="20"/>
+              </w:rPr>
               <w:t>After students submit, facilitate a 3–5</w:t>
             </w:r>
             <w:r>
               <w:rPr>
-                <w:rFonts w:asciiTheme="minorHAnsi" w:hAnsiTheme="minorHAnsi" w:cstheme="minorHAnsi"/>
                 <w:b/>
                 <w:bCs/>
-                <w:sz w:val="24"/>
-                <w:szCs w:val="24"/>
+                <w:sz w:val="20"/>
+                <w:szCs w:val="20"/>
               </w:rPr>
               <w:t xml:space="preserve"> m</w:t>
             </w:r>
             <w:r>
               <w:rPr>
-                <w:rFonts w:asciiTheme="minorHAnsi" w:hAnsiTheme="minorHAnsi" w:cstheme="minorHAnsi"/>
                 <w:b/>
                 <w:bCs/>
-                <w:sz w:val="24"/>
-                <w:szCs w:val="24"/>
+                <w:sz w:val="20"/>
+                <w:szCs w:val="20"/>
               </w:rPr>
               <w:t>inute</w:t>
             </w:r>
             <w:r>
               <w:rPr>
-                <w:rFonts w:asciiTheme="minorHAnsi" w:hAnsiTheme="minorHAnsi" w:cstheme="minorHAnsi"/>
                 <w:b/>
                 <w:bCs/>
-                <w:sz w:val="24"/>
-                <w:szCs w:val="24"/>
+                <w:sz w:val="20"/>
+                <w:szCs w:val="20"/>
               </w:rPr>
               <w:t>s</w:t>
             </w:r>
             <w:r>
               <w:rPr>
-                <w:rFonts w:asciiTheme="minorHAnsi" w:hAnsiTheme="minorHAnsi" w:cstheme="minorHAnsi"/>
                 <w:b/>
                 <w:bCs/>
-                <w:sz w:val="24"/>
-                <w:szCs w:val="24"/>
+                <w:sz w:val="20"/>
+                <w:szCs w:val="20"/>
               </w:rPr>
               <w:t xml:space="preserve"> whole-class share-out:</w:t>
             </w:r>
@@ -3482,49 +2983,42 @@
               </w:numPr>
               <w:spacing w:before="40" w:after="40"/>
               <w:rPr>
-                <w:rFonts w:asciiTheme="minorHAnsi" w:hAnsiTheme="minorHAnsi" w:cstheme="minorHAnsi"/>
-                <w:sz w:val="24"/>
-                <w:szCs w:val="24"/>
-              </w:rPr>
-            </w:pPr>
-            <w:r>
-              <w:rPr>
-                <w:rFonts w:asciiTheme="minorHAnsi" w:hAnsiTheme="minorHAnsi" w:cstheme="minorHAnsi"/>
-                <w:sz w:val="24"/>
-                <w:szCs w:val="24"/>
-              </w:rPr>
-              <w:lastRenderedPageBreak/>
+                <w:sz w:val="20"/>
+                <w:szCs w:val="20"/>
+              </w:rPr>
+            </w:pPr>
+            <w:r>
+              <w:rPr>
+                <w:sz w:val="20"/>
+                <w:szCs w:val="20"/>
+              </w:rPr>
               <w:t xml:space="preserve">Ask 2–3 students to share their Q2 answer </w:t>
             </w:r>
             <w:r>
               <w:rPr>
-                <w:rFonts w:asciiTheme="minorHAnsi" w:hAnsiTheme="minorHAnsi" w:cstheme="minorHAnsi"/>
-                <w:sz w:val="24"/>
-                <w:szCs w:val="24"/>
+                <w:sz w:val="20"/>
+                <w:szCs w:val="20"/>
               </w:rPr>
               <w:t>-&gt;</w:t>
             </w:r>
             <w:r>
               <w:rPr>
-                <w:rFonts w:asciiTheme="minorHAnsi" w:hAnsiTheme="minorHAnsi" w:cstheme="minorHAnsi"/>
-                <w:sz w:val="24"/>
-                <w:szCs w:val="24"/>
+                <w:sz w:val="20"/>
+                <w:szCs w:val="20"/>
               </w:rPr>
               <w:t xml:space="preserve"> </w:t>
             </w:r>
             <w:r>
               <w:rPr>
-                <w:rFonts w:asciiTheme="minorHAnsi" w:hAnsiTheme="minorHAnsi" w:cstheme="minorHAnsi"/>
-                <w:sz w:val="24"/>
-                <w:szCs w:val="24"/>
+                <w:sz w:val="20"/>
+                <w:szCs w:val="20"/>
               </w:rPr>
               <w:t>this surface</w:t>
             </w:r>
             <w:r>
               <w:rPr>
-                <w:rFonts w:asciiTheme="minorHAnsi" w:hAnsiTheme="minorHAnsi" w:cstheme="minorHAnsi"/>
-                <w:sz w:val="24"/>
-                <w:szCs w:val="24"/>
+                <w:sz w:val="20"/>
+                <w:szCs w:val="20"/>
               </w:rPr>
               <w:t xml:space="preserve"> which representation different students found most accessible</w:t>
             </w:r>
@@ -3538,24 +3032,21 @@
               </w:numPr>
               <w:spacing w:before="40" w:after="40"/>
               <w:rPr>
-                <w:rFonts w:asciiTheme="minorHAnsi" w:hAnsiTheme="minorHAnsi" w:cstheme="minorHAnsi"/>
-                <w:sz w:val="24"/>
-                <w:szCs w:val="24"/>
-              </w:rPr>
-            </w:pPr>
-            <w:r>
-              <w:rPr>
-                <w:rFonts w:asciiTheme="minorHAnsi" w:hAnsiTheme="minorHAnsi" w:cstheme="minorHAnsi"/>
-                <w:sz w:val="24"/>
-                <w:szCs w:val="24"/>
+                <w:sz w:val="20"/>
+                <w:szCs w:val="20"/>
+              </w:rPr>
+            </w:pPr>
+            <w:r>
+              <w:rPr>
+                <w:sz w:val="20"/>
+                <w:szCs w:val="20"/>
               </w:rPr>
               <w:t>Collect Q3 responses as formative data for L</w:t>
             </w:r>
             <w:r>
               <w:rPr>
-                <w:rFonts w:asciiTheme="minorHAnsi" w:hAnsiTheme="minorHAnsi" w:cstheme="minorHAnsi"/>
-                <w:sz w:val="24"/>
-                <w:szCs w:val="24"/>
+                <w:sz w:val="20"/>
+                <w:szCs w:val="20"/>
               </w:rPr>
               <w:t>1</w:t>
             </w:r>
@@ -3564,9 +3055,8 @@
             <w:pPr>
               <w:spacing w:before="60" w:after="60"/>
               <w:rPr>
-                <w:rFonts w:asciiTheme="minorHAnsi" w:hAnsiTheme="minorHAnsi" w:cstheme="minorHAnsi"/>
-                <w:sz w:val="24"/>
-                <w:szCs w:val="24"/>
+                <w:sz w:val="20"/>
+                <w:szCs w:val="20"/>
               </w:rPr>
             </w:pPr>
           </w:p>
@@ -3574,18 +3064,16 @@
             <w:pPr>
               <w:spacing w:before="60" w:after="60"/>
               <w:rPr>
-                <w:rFonts w:asciiTheme="minorHAnsi" w:hAnsiTheme="minorHAnsi" w:cstheme="minorHAnsi"/>
-                <w:sz w:val="24"/>
-                <w:szCs w:val="24"/>
-              </w:rPr>
-            </w:pPr>
-            <w:r>
-              <w:rPr>
-                <w:rFonts w:asciiTheme="minorHAnsi" w:hAnsiTheme="minorHAnsi" w:cstheme="minorHAnsi"/>
+                <w:sz w:val="20"/>
+                <w:szCs w:val="20"/>
+              </w:rPr>
+            </w:pPr>
+            <w:r>
+              <w:rPr>
                 <w:b/>
                 <w:bCs/>
-                <w:sz w:val="24"/>
-                <w:szCs w:val="24"/>
+                <w:sz w:val="20"/>
+                <w:szCs w:val="20"/>
               </w:rPr>
               <w:t>Watch for:</w:t>
             </w:r>
@@ -3599,32 +3087,28 @@
               </w:numPr>
               <w:spacing w:before="40" w:after="40"/>
               <w:rPr>
-                <w:rFonts w:asciiTheme="minorHAnsi" w:hAnsiTheme="minorHAnsi" w:cstheme="minorHAnsi"/>
-                <w:sz w:val="24"/>
-                <w:szCs w:val="24"/>
-              </w:rPr>
-            </w:pPr>
-            <w:r>
-              <w:rPr>
-                <w:rFonts w:asciiTheme="minorHAnsi" w:hAnsiTheme="minorHAnsi" w:cstheme="minorHAnsi"/>
-                <w:sz w:val="24"/>
-                <w:szCs w:val="24"/>
+                <w:sz w:val="20"/>
+                <w:szCs w:val="20"/>
+              </w:rPr>
+            </w:pPr>
+            <w:r>
+              <w:rPr>
+                <w:sz w:val="20"/>
+                <w:szCs w:val="20"/>
               </w:rPr>
               <w:t xml:space="preserve">Students who say the three representations look different and are not connected </w:t>
             </w:r>
             <w:r>
               <w:rPr>
-                <w:rFonts w:asciiTheme="minorHAnsi" w:hAnsiTheme="minorHAnsi" w:cstheme="minorHAnsi"/>
-                <w:sz w:val="24"/>
-                <w:szCs w:val="24"/>
+                <w:sz w:val="20"/>
+                <w:szCs w:val="20"/>
               </w:rPr>
               <w:t>-&gt;</w:t>
             </w:r>
             <w:r>
               <w:rPr>
-                <w:rFonts w:asciiTheme="minorHAnsi" w:hAnsiTheme="minorHAnsi" w:cstheme="minorHAnsi"/>
-                <w:sz w:val="24"/>
-                <w:szCs w:val="24"/>
+                <w:sz w:val="20"/>
+                <w:szCs w:val="20"/>
               </w:rPr>
               <w:t xml:space="preserve"> this is the key misconception to address before L1</w:t>
             </w:r>
@@ -3636,20 +3120,17 @@
       <w:pPr>
         <w:pStyle w:val="Heading1"/>
         <w:rPr>
-          <w:rFonts w:asciiTheme="minorHAnsi" w:hAnsiTheme="minorHAnsi" w:cstheme="minorHAnsi"/>
           <w:color w:val="auto"/>
-          <w:sz w:val="24"/>
-          <w:szCs w:val="24"/>
-        </w:rPr>
-      </w:pPr>
-      <w:r>
-        <w:rPr>
-          <w:rFonts w:asciiTheme="minorHAnsi" w:hAnsiTheme="minorHAnsi" w:cstheme="minorHAnsi"/>
+          <w:sz w:val="20"/>
+          <w:szCs w:val="20"/>
+        </w:rPr>
+      </w:pPr>
+      <w:r>
+        <w:rPr>
           <w:color w:val="auto"/>
-          <w:sz w:val="24"/>
-          <w:szCs w:val="24"/>
-        </w:rPr>
-        <w:lastRenderedPageBreak/>
+          <w:sz w:val="20"/>
+          <w:szCs w:val="20"/>
+        </w:rPr>
         <w:t>After Class — Teacher Follow-up</w:t>
       </w:r>
     </w:p>
@@ -3662,16 +3143,14 @@
         </w:numPr>
         <w:spacing w:before="60" w:after="60"/>
         <w:rPr>
-          <w:rFonts w:asciiTheme="minorHAnsi" w:hAnsiTheme="minorHAnsi" w:cstheme="minorHAnsi"/>
-          <w:sz w:val="24"/>
-          <w:szCs w:val="24"/>
-        </w:rPr>
-      </w:pPr>
-      <w:r>
-        <w:rPr>
-          <w:rFonts w:asciiTheme="minorHAnsi" w:hAnsiTheme="minorHAnsi" w:cstheme="minorHAnsi"/>
-          <w:sz w:val="24"/>
-          <w:szCs w:val="24"/>
+          <w:sz w:val="20"/>
+          <w:szCs w:val="20"/>
+        </w:rPr>
+      </w:pPr>
+      <w:r>
+        <w:rPr>
+          <w:sz w:val="20"/>
+          <w:szCs w:val="20"/>
         </w:rPr>
         <w:t>Which students did not reach Step 5? They may need a re-entry activity at the start of L1.</w:t>
       </w:r>
@@ -3685,16 +3164,14 @@
         </w:numPr>
         <w:spacing w:before="60" w:after="60"/>
         <w:rPr>
-          <w:rFonts w:asciiTheme="minorHAnsi" w:hAnsiTheme="minorHAnsi" w:cstheme="minorHAnsi"/>
-          <w:sz w:val="24"/>
-          <w:szCs w:val="24"/>
-        </w:rPr>
-      </w:pPr>
-      <w:r>
-        <w:rPr>
-          <w:rFonts w:asciiTheme="minorHAnsi" w:hAnsiTheme="minorHAnsi" w:cstheme="minorHAnsi"/>
-          <w:sz w:val="24"/>
-          <w:szCs w:val="24"/>
+          <w:sz w:val="20"/>
+          <w:szCs w:val="20"/>
+        </w:rPr>
+      </w:pPr>
+      <w:r>
+        <w:rPr>
+          <w:sz w:val="20"/>
+          <w:szCs w:val="20"/>
         </w:rPr>
         <w:t>Which students chose Subtraction in Step 2? Address the older/younger confusion explicitly in L1 (Lesson 1B introduces subtraction as a natural contrast).</w:t>
       </w:r>
@@ -3708,16 +3185,14 @@
         </w:numPr>
         <w:spacing w:before="60" w:after="60"/>
         <w:rPr>
-          <w:rFonts w:asciiTheme="minorHAnsi" w:hAnsiTheme="minorHAnsi" w:cstheme="minorHAnsi"/>
-          <w:sz w:val="24"/>
-          <w:szCs w:val="24"/>
-        </w:rPr>
-      </w:pPr>
-      <w:r>
-        <w:rPr>
-          <w:rFonts w:asciiTheme="minorHAnsi" w:hAnsiTheme="minorHAnsi" w:cstheme="minorHAnsi"/>
-          <w:sz w:val="24"/>
-          <w:szCs w:val="24"/>
+          <w:sz w:val="20"/>
+          <w:szCs w:val="20"/>
+        </w:rPr>
+      </w:pPr>
+      <w:r>
+        <w:rPr>
+          <w:sz w:val="20"/>
+          <w:szCs w:val="20"/>
         </w:rPr>
         <w:t>Collect strong Q3 responses to open L1 with a student-generated context.</w:t>
       </w:r>
@@ -3726,18 +3201,16 @@
       <w:pPr>
         <w:spacing w:before="80" w:after="80"/>
         <w:rPr>
-          <w:rFonts w:asciiTheme="minorHAnsi" w:hAnsiTheme="minorHAnsi" w:cstheme="minorHAnsi"/>
-          <w:sz w:val="24"/>
-          <w:szCs w:val="24"/>
-        </w:rPr>
-      </w:pPr>
-      <w:r>
-        <w:rPr>
-          <w:rFonts w:asciiTheme="minorHAnsi" w:hAnsiTheme="minorHAnsi" w:cstheme="minorHAnsi"/>
+          <w:sz w:val="20"/>
+          <w:szCs w:val="20"/>
+        </w:rPr>
+      </w:pPr>
+      <w:r>
+        <w:rPr>
           <w:b/>
           <w:bCs/>
-          <w:sz w:val="24"/>
-          <w:szCs w:val="24"/>
+          <w:sz w:val="20"/>
+          <w:szCs w:val="20"/>
         </w:rPr>
         <w:t>Extension for early finishers:</w:t>
       </w:r>
@@ -3746,18 +3219,16 @@
       <w:pPr>
         <w:spacing w:before="80" w:after="80"/>
         <w:rPr>
-          <w:rFonts w:asciiTheme="minorHAnsi" w:hAnsiTheme="minorHAnsi" w:cstheme="minorHAnsi"/>
-          <w:sz w:val="24"/>
-          <w:szCs w:val="24"/>
-        </w:rPr>
-      </w:pPr>
-      <w:r>
-        <w:rPr>
-          <w:rFonts w:asciiTheme="minorHAnsi" w:hAnsiTheme="minorHAnsi" w:cstheme="minorHAnsi"/>
+          <w:sz w:val="20"/>
+          <w:szCs w:val="20"/>
+        </w:rPr>
+      </w:pPr>
+      <w:r>
+        <w:rPr>
           <w:i/>
           <w:iCs/>
-          <w:sz w:val="24"/>
-          <w:szCs w:val="24"/>
+          <w:sz w:val="20"/>
+          <w:szCs w:val="20"/>
         </w:rPr>
         <w:t>“What if Thamarai were 6 years older instead of 4? What changes in the expression, the graph, and the code?”</w:t>
       </w:r>
@@ -3766,18 +3237,16 @@
       <w:pPr>
         <w:pStyle w:val="Heading1"/>
         <w:rPr>
-          <w:rFonts w:asciiTheme="minorHAnsi" w:hAnsiTheme="minorHAnsi" w:cstheme="minorHAnsi"/>
           <w:color w:val="auto"/>
-          <w:sz w:val="24"/>
-          <w:szCs w:val="24"/>
-        </w:rPr>
-      </w:pPr>
-      <w:r>
-        <w:rPr>
-          <w:rFonts w:asciiTheme="minorHAnsi" w:hAnsiTheme="minorHAnsi" w:cstheme="minorHAnsi"/>
+          <w:sz w:val="20"/>
+          <w:szCs w:val="20"/>
+        </w:rPr>
+      </w:pPr>
+      <w:r>
+        <w:rPr>
           <w:color w:val="auto"/>
-          <w:sz w:val="24"/>
-          <w:szCs w:val="24"/>
+          <w:sz w:val="20"/>
+          <w:szCs w:val="20"/>
         </w:rPr>
         <w:t>Assessment Summary</w:t>
       </w:r>
@@ -3785,9 +3254,8 @@
     <w:p>
       <w:pPr>
         <w:rPr>
-          <w:rFonts w:asciiTheme="minorHAnsi" w:hAnsiTheme="minorHAnsi" w:cstheme="minorHAnsi"/>
-          <w:sz w:val="24"/>
-          <w:szCs w:val="24"/>
+          <w:sz w:val="20"/>
+          <w:szCs w:val="20"/>
         </w:rPr>
       </w:pPr>
     </w:p>
@@ -3814,12 +3282,6 @@
         <w:gridCol w:w="2557"/>
       </w:tblGrid>
       <w:tr>
-        <w:tblPrEx>
-          <w:tblCellMar>
-            <w:top w:w="0" w:type="dxa"/>
-            <w:bottom w:w="0" w:type="dxa"/>
-          </w:tblCellMar>
-        </w:tblPrEx>
         <w:tc>
           <w:tcPr>
             <w:tcW w:w="2500" w:type="dxa"/>
@@ -3840,18 +3302,16 @@
           <w:p>
             <w:pPr>
               <w:rPr>
-                <w:rFonts w:asciiTheme="minorHAnsi" w:hAnsiTheme="minorHAnsi" w:cstheme="minorHAnsi"/>
-                <w:sz w:val="24"/>
-                <w:szCs w:val="24"/>
-              </w:rPr>
-            </w:pPr>
-            <w:r>
-              <w:rPr>
-                <w:rFonts w:asciiTheme="minorHAnsi" w:hAnsiTheme="minorHAnsi" w:cstheme="minorHAnsi"/>
+                <w:sz w:val="20"/>
+                <w:szCs w:val="20"/>
+              </w:rPr>
+            </w:pPr>
+            <w:r>
+              <w:rPr>
                 <w:b/>
                 <w:bCs/>
-                <w:sz w:val="24"/>
-                <w:szCs w:val="24"/>
+                <w:sz w:val="20"/>
+                <w:szCs w:val="20"/>
               </w:rPr>
               <w:t>Type</w:t>
             </w:r>
@@ -3877,18 +3337,16 @@
           <w:p>
             <w:pPr>
               <w:rPr>
-                <w:rFonts w:asciiTheme="minorHAnsi" w:hAnsiTheme="minorHAnsi" w:cstheme="minorHAnsi"/>
-                <w:sz w:val="24"/>
-                <w:szCs w:val="24"/>
-              </w:rPr>
-            </w:pPr>
-            <w:r>
-              <w:rPr>
-                <w:rFonts w:asciiTheme="minorHAnsi" w:hAnsiTheme="minorHAnsi" w:cstheme="minorHAnsi"/>
+                <w:sz w:val="20"/>
+                <w:szCs w:val="20"/>
+              </w:rPr>
+            </w:pPr>
+            <w:r>
+              <w:rPr>
                 <w:b/>
                 <w:bCs/>
-                <w:sz w:val="24"/>
-                <w:szCs w:val="24"/>
+                <w:sz w:val="20"/>
+                <w:szCs w:val="20"/>
               </w:rPr>
               <w:t>Evidence</w:t>
             </w:r>
@@ -3914,18 +3372,16 @@
           <w:p>
             <w:pPr>
               <w:rPr>
-                <w:rFonts w:asciiTheme="minorHAnsi" w:hAnsiTheme="minorHAnsi" w:cstheme="minorHAnsi"/>
-                <w:sz w:val="24"/>
-                <w:szCs w:val="24"/>
-              </w:rPr>
-            </w:pPr>
-            <w:r>
-              <w:rPr>
-                <w:rFonts w:asciiTheme="minorHAnsi" w:hAnsiTheme="minorHAnsi" w:cstheme="minorHAnsi"/>
+                <w:sz w:val="20"/>
+                <w:szCs w:val="20"/>
+              </w:rPr>
+            </w:pPr>
+            <w:r>
+              <w:rPr>
                 <w:b/>
                 <w:bCs/>
-                <w:sz w:val="24"/>
-                <w:szCs w:val="24"/>
+                <w:sz w:val="20"/>
+                <w:szCs w:val="20"/>
               </w:rPr>
               <w:t>Where in IDE</w:t>
             </w:r>
@@ -3933,12 +3389,6 @@
         </w:tc>
       </w:tr>
       <w:tr>
-        <w:tblPrEx>
-          <w:tblCellMar>
-            <w:top w:w="0" w:type="dxa"/>
-            <w:bottom w:w="0" w:type="dxa"/>
-          </w:tblCellMar>
-        </w:tblPrEx>
         <w:tc>
           <w:tcPr>
             <w:tcW w:w="2500" w:type="dxa"/>
@@ -3958,32 +3408,28 @@
           <w:p>
             <w:pPr>
               <w:rPr>
-                <w:rFonts w:asciiTheme="minorHAnsi" w:hAnsiTheme="minorHAnsi" w:cstheme="minorHAnsi"/>
-                <w:sz w:val="24"/>
-                <w:szCs w:val="24"/>
-              </w:rPr>
-            </w:pPr>
-            <w:r>
-              <w:rPr>
-                <w:rFonts w:asciiTheme="minorHAnsi" w:hAnsiTheme="minorHAnsi" w:cstheme="minorHAnsi"/>
-                <w:sz w:val="24"/>
-                <w:szCs w:val="24"/>
+                <w:sz w:val="20"/>
+                <w:szCs w:val="20"/>
+              </w:rPr>
+            </w:pPr>
+            <w:r>
+              <w:rPr>
+                <w:sz w:val="20"/>
+                <w:szCs w:val="20"/>
               </w:rPr>
               <w:t xml:space="preserve">Formative </w:t>
             </w:r>
             <w:r>
               <w:rPr>
-                <w:rFonts w:asciiTheme="minorHAnsi" w:hAnsiTheme="minorHAnsi" w:cstheme="minorHAnsi"/>
-                <w:sz w:val="24"/>
-                <w:szCs w:val="24"/>
+                <w:sz w:val="20"/>
+                <w:szCs w:val="20"/>
               </w:rPr>
               <w:t>-&gt;</w:t>
             </w:r>
             <w:r>
               <w:rPr>
-                <w:rFonts w:asciiTheme="minorHAnsi" w:hAnsiTheme="minorHAnsi" w:cstheme="minorHAnsi"/>
-                <w:sz w:val="24"/>
-                <w:szCs w:val="24"/>
+                <w:sz w:val="20"/>
+                <w:szCs w:val="20"/>
               </w:rPr>
               <w:t xml:space="preserve"> in-process</w:t>
             </w:r>
@@ -4008,16 +3454,14 @@
           <w:p>
             <w:pPr>
               <w:rPr>
-                <w:rFonts w:asciiTheme="minorHAnsi" w:hAnsiTheme="minorHAnsi" w:cstheme="minorHAnsi"/>
-                <w:sz w:val="24"/>
-                <w:szCs w:val="24"/>
-              </w:rPr>
-            </w:pPr>
-            <w:r>
-              <w:rPr>
-                <w:rFonts w:asciiTheme="minorHAnsi" w:hAnsiTheme="minorHAnsi" w:cstheme="minorHAnsi"/>
-                <w:sz w:val="24"/>
-                <w:szCs w:val="24"/>
+                <w:sz w:val="20"/>
+                <w:szCs w:val="20"/>
+              </w:rPr>
+            </w:pPr>
+            <w:r>
+              <w:rPr>
+                <w:sz w:val="20"/>
+                <w:szCs w:val="20"/>
               </w:rPr>
               <w:t>Step 1 open-ended; Step 4 expression builder; Step 5 variable naming</w:t>
             </w:r>
@@ -4042,16 +3486,14 @@
           <w:p>
             <w:pPr>
               <w:rPr>
-                <w:rFonts w:asciiTheme="minorHAnsi" w:hAnsiTheme="minorHAnsi" w:cstheme="minorHAnsi"/>
-                <w:sz w:val="24"/>
-                <w:szCs w:val="24"/>
-              </w:rPr>
-            </w:pPr>
-            <w:r>
-              <w:rPr>
-                <w:rFonts w:asciiTheme="minorHAnsi" w:hAnsiTheme="minorHAnsi" w:cstheme="minorHAnsi"/>
-                <w:sz w:val="24"/>
-                <w:szCs w:val="24"/>
+                <w:sz w:val="20"/>
+                <w:szCs w:val="20"/>
+              </w:rPr>
+            </w:pPr>
+            <w:r>
+              <w:rPr>
+                <w:sz w:val="20"/>
+                <w:szCs w:val="20"/>
               </w:rPr>
               <w:t>Task tab — Steps 1, 4, 5</w:t>
             </w:r>
@@ -4059,12 +3501,6 @@
         </w:tc>
       </w:tr>
       <w:tr>
-        <w:tblPrEx>
-          <w:tblCellMar>
-            <w:top w:w="0" w:type="dxa"/>
-            <w:bottom w:w="0" w:type="dxa"/>
-          </w:tblCellMar>
-        </w:tblPrEx>
         <w:tc>
           <w:tcPr>
             <w:tcW w:w="2500" w:type="dxa"/>
@@ -4084,32 +3520,28 @@
           <w:p>
             <w:pPr>
               <w:rPr>
-                <w:rFonts w:asciiTheme="minorHAnsi" w:hAnsiTheme="minorHAnsi" w:cstheme="minorHAnsi"/>
-                <w:sz w:val="24"/>
-                <w:szCs w:val="24"/>
-              </w:rPr>
-            </w:pPr>
-            <w:r>
-              <w:rPr>
-                <w:rFonts w:asciiTheme="minorHAnsi" w:hAnsiTheme="minorHAnsi" w:cstheme="minorHAnsi"/>
-                <w:sz w:val="24"/>
-                <w:szCs w:val="24"/>
+                <w:sz w:val="20"/>
+                <w:szCs w:val="20"/>
+              </w:rPr>
+            </w:pPr>
+            <w:r>
+              <w:rPr>
+                <w:sz w:val="20"/>
+                <w:szCs w:val="20"/>
               </w:rPr>
               <w:t xml:space="preserve">Formative </w:t>
             </w:r>
             <w:r>
               <w:rPr>
-                <w:rFonts w:asciiTheme="minorHAnsi" w:hAnsiTheme="minorHAnsi" w:cstheme="minorHAnsi"/>
-                <w:sz w:val="24"/>
-                <w:szCs w:val="24"/>
+                <w:sz w:val="20"/>
+                <w:szCs w:val="20"/>
               </w:rPr>
               <w:t>-&gt;</w:t>
             </w:r>
             <w:r>
               <w:rPr>
-                <w:rFonts w:asciiTheme="minorHAnsi" w:hAnsiTheme="minorHAnsi" w:cstheme="minorHAnsi"/>
-                <w:sz w:val="24"/>
-                <w:szCs w:val="24"/>
+                <w:sz w:val="20"/>
+                <w:szCs w:val="20"/>
               </w:rPr>
               <w:t xml:space="preserve"> conceptual</w:t>
             </w:r>
@@ -4134,16 +3566,14 @@
           <w:p>
             <w:pPr>
               <w:rPr>
-                <w:rFonts w:asciiTheme="minorHAnsi" w:hAnsiTheme="minorHAnsi" w:cstheme="minorHAnsi"/>
-                <w:sz w:val="24"/>
-                <w:szCs w:val="24"/>
-              </w:rPr>
-            </w:pPr>
-            <w:r>
-              <w:rPr>
-                <w:rFonts w:asciiTheme="minorHAnsi" w:hAnsiTheme="minorHAnsi" w:cstheme="minorHAnsi"/>
-                <w:sz w:val="24"/>
-                <w:szCs w:val="24"/>
+                <w:sz w:val="20"/>
+                <w:szCs w:val="20"/>
+              </w:rPr>
+            </w:pPr>
+            <w:r>
+              <w:rPr>
+                <w:sz w:val="20"/>
+                <w:szCs w:val="20"/>
               </w:rPr>
               <w:t>Desmos comprehension question: Increases / Decreases / Stays the same</w:t>
             </w:r>
@@ -4168,16 +3598,14 @@
           <w:p>
             <w:pPr>
               <w:rPr>
-                <w:rFonts w:asciiTheme="minorHAnsi" w:hAnsiTheme="minorHAnsi" w:cstheme="minorHAnsi"/>
-                <w:sz w:val="24"/>
-                <w:szCs w:val="24"/>
-              </w:rPr>
-            </w:pPr>
-            <w:r>
-              <w:rPr>
-                <w:rFonts w:asciiTheme="minorHAnsi" w:hAnsiTheme="minorHAnsi" w:cstheme="minorHAnsi"/>
-                <w:sz w:val="24"/>
-                <w:szCs w:val="24"/>
+                <w:sz w:val="20"/>
+                <w:szCs w:val="20"/>
+              </w:rPr>
+            </w:pPr>
+            <w:r>
+              <w:rPr>
+                <w:sz w:val="20"/>
+                <w:szCs w:val="20"/>
               </w:rPr>
               <w:t>Desmos tab</w:t>
             </w:r>
@@ -4185,12 +3613,6 @@
         </w:tc>
       </w:tr>
       <w:tr>
-        <w:tblPrEx>
-          <w:tblCellMar>
-            <w:top w:w="0" w:type="dxa"/>
-            <w:bottom w:w="0" w:type="dxa"/>
-          </w:tblCellMar>
-        </w:tblPrEx>
         <w:tc>
           <w:tcPr>
             <w:tcW w:w="2500" w:type="dxa"/>
@@ -4210,32 +3632,28 @@
           <w:p>
             <w:pPr>
               <w:rPr>
-                <w:rFonts w:asciiTheme="minorHAnsi" w:hAnsiTheme="minorHAnsi" w:cstheme="minorHAnsi"/>
-                <w:sz w:val="24"/>
-                <w:szCs w:val="24"/>
-              </w:rPr>
-            </w:pPr>
-            <w:r>
-              <w:rPr>
-                <w:rFonts w:asciiTheme="minorHAnsi" w:hAnsiTheme="minorHAnsi" w:cstheme="minorHAnsi"/>
-                <w:sz w:val="24"/>
-                <w:szCs w:val="24"/>
+                <w:sz w:val="20"/>
+                <w:szCs w:val="20"/>
+              </w:rPr>
+            </w:pPr>
+            <w:r>
+              <w:rPr>
+                <w:sz w:val="20"/>
+                <w:szCs w:val="20"/>
               </w:rPr>
               <w:t xml:space="preserve">Formative </w:t>
             </w:r>
             <w:r>
               <w:rPr>
-                <w:rFonts w:asciiTheme="minorHAnsi" w:hAnsiTheme="minorHAnsi" w:cstheme="minorHAnsi"/>
-                <w:sz w:val="24"/>
-                <w:szCs w:val="24"/>
+                <w:sz w:val="20"/>
+                <w:szCs w:val="20"/>
               </w:rPr>
               <w:t>-&gt;</w:t>
             </w:r>
             <w:r>
               <w:rPr>
-                <w:rFonts w:asciiTheme="minorHAnsi" w:hAnsiTheme="minorHAnsi" w:cstheme="minorHAnsi"/>
-                <w:sz w:val="24"/>
-                <w:szCs w:val="24"/>
+                <w:sz w:val="20"/>
+                <w:szCs w:val="20"/>
               </w:rPr>
               <w:t xml:space="preserve"> procedural</w:t>
             </w:r>
@@ -4260,28 +3678,16 @@
           <w:p>
             <w:pPr>
               <w:rPr>
-                <w:rFonts w:asciiTheme="minorHAnsi" w:hAnsiTheme="minorHAnsi" w:cstheme="minorHAnsi"/>
-                <w:sz w:val="24"/>
-                <w:szCs w:val="24"/>
-              </w:rPr>
-            </w:pPr>
-            <w:proofErr w:type="spellStart"/>
-            <w:r>
-              <w:rPr>
-                <w:rFonts w:asciiTheme="minorHAnsi" w:hAnsiTheme="minorHAnsi" w:cstheme="minorHAnsi"/>
-                <w:sz w:val="24"/>
-                <w:szCs w:val="24"/>
-              </w:rPr>
-              <w:t>Pyret</w:t>
-            </w:r>
-            <w:proofErr w:type="spellEnd"/>
-            <w:r>
-              <w:rPr>
-                <w:rFonts w:asciiTheme="minorHAnsi" w:hAnsiTheme="minorHAnsi" w:cstheme="minorHAnsi"/>
-                <w:sz w:val="24"/>
-                <w:szCs w:val="24"/>
-              </w:rPr>
-              <w:t xml:space="preserve"> try-it: does the function return correct values?</w:t>
+                <w:sz w:val="20"/>
+                <w:szCs w:val="20"/>
+              </w:rPr>
+            </w:pPr>
+            <w:r>
+              <w:rPr>
+                <w:sz w:val="20"/>
+                <w:szCs w:val="20"/>
+              </w:rPr>
+              <w:t>Pyret try-it: does the function return correct values?</w:t>
             </w:r>
           </w:p>
         </w:tc>
@@ -4304,39 +3710,21 @@
           <w:p>
             <w:pPr>
               <w:rPr>
-                <w:rFonts w:asciiTheme="minorHAnsi" w:hAnsiTheme="minorHAnsi" w:cstheme="minorHAnsi"/>
-                <w:sz w:val="24"/>
-                <w:szCs w:val="24"/>
-              </w:rPr>
-            </w:pPr>
-            <w:proofErr w:type="spellStart"/>
-            <w:r>
-              <w:rPr>
-                <w:rFonts w:asciiTheme="minorHAnsi" w:hAnsiTheme="minorHAnsi" w:cstheme="minorHAnsi"/>
-                <w:sz w:val="24"/>
-                <w:szCs w:val="24"/>
-              </w:rPr>
-              <w:t>Pyret</w:t>
-            </w:r>
-            <w:proofErr w:type="spellEnd"/>
-            <w:r>
-              <w:rPr>
-                <w:rFonts w:asciiTheme="minorHAnsi" w:hAnsiTheme="minorHAnsi" w:cstheme="minorHAnsi"/>
-                <w:sz w:val="24"/>
-                <w:szCs w:val="24"/>
-              </w:rPr>
-              <w:t xml:space="preserve"> tab</w:t>
+                <w:sz w:val="20"/>
+                <w:szCs w:val="20"/>
+              </w:rPr>
+            </w:pPr>
+            <w:r>
+              <w:rPr>
+                <w:sz w:val="20"/>
+                <w:szCs w:val="20"/>
+              </w:rPr>
+              <w:t>Pyret tab</w:t>
             </w:r>
           </w:p>
         </w:tc>
       </w:tr>
       <w:tr>
-        <w:tblPrEx>
-          <w:tblCellMar>
-            <w:top w:w="0" w:type="dxa"/>
-            <w:bottom w:w="0" w:type="dxa"/>
-          </w:tblCellMar>
-        </w:tblPrEx>
         <w:tc>
           <w:tcPr>
             <w:tcW w:w="2500" w:type="dxa"/>
@@ -4356,32 +3744,28 @@
           <w:p>
             <w:pPr>
               <w:rPr>
-                <w:rFonts w:asciiTheme="minorHAnsi" w:hAnsiTheme="minorHAnsi" w:cstheme="minorHAnsi"/>
-                <w:sz w:val="24"/>
-                <w:szCs w:val="24"/>
-              </w:rPr>
-            </w:pPr>
-            <w:r>
-              <w:rPr>
-                <w:rFonts w:asciiTheme="minorHAnsi" w:hAnsiTheme="minorHAnsi" w:cstheme="minorHAnsi"/>
-                <w:sz w:val="24"/>
-                <w:szCs w:val="24"/>
+                <w:sz w:val="20"/>
+                <w:szCs w:val="20"/>
+              </w:rPr>
+            </w:pPr>
+            <w:r>
+              <w:rPr>
+                <w:sz w:val="20"/>
+                <w:szCs w:val="20"/>
               </w:rPr>
               <w:t xml:space="preserve">Summative </w:t>
             </w:r>
             <w:r>
               <w:rPr>
-                <w:rFonts w:asciiTheme="minorHAnsi" w:hAnsiTheme="minorHAnsi" w:cstheme="minorHAnsi"/>
-                <w:sz w:val="24"/>
-                <w:szCs w:val="24"/>
+                <w:sz w:val="20"/>
+                <w:szCs w:val="20"/>
               </w:rPr>
               <w:t>-&gt;</w:t>
             </w:r>
             <w:r>
               <w:rPr>
-                <w:rFonts w:asciiTheme="minorHAnsi" w:hAnsiTheme="minorHAnsi" w:cstheme="minorHAnsi"/>
-                <w:sz w:val="24"/>
-                <w:szCs w:val="24"/>
+                <w:sz w:val="20"/>
+                <w:szCs w:val="20"/>
               </w:rPr>
               <w:t xml:space="preserve"> synthesis</w:t>
             </w:r>
@@ -4406,16 +3790,14 @@
           <w:p>
             <w:pPr>
               <w:rPr>
-                <w:rFonts w:asciiTheme="minorHAnsi" w:hAnsiTheme="minorHAnsi" w:cstheme="minorHAnsi"/>
-                <w:sz w:val="24"/>
-                <w:szCs w:val="24"/>
-              </w:rPr>
-            </w:pPr>
-            <w:r>
-              <w:rPr>
-                <w:rFonts w:asciiTheme="minorHAnsi" w:hAnsiTheme="minorHAnsi" w:cstheme="minorHAnsi"/>
-                <w:sz w:val="24"/>
-                <w:szCs w:val="24"/>
+                <w:sz w:val="20"/>
+                <w:szCs w:val="20"/>
+              </w:rPr>
+            </w:pPr>
+            <w:r>
+              <w:rPr>
+                <w:sz w:val="20"/>
+                <w:szCs w:val="20"/>
               </w:rPr>
               <w:t>Check Q1: connects all three representations; Q3: transfer to new context</w:t>
             </w:r>
@@ -4440,16 +3822,14 @@
           <w:p>
             <w:pPr>
               <w:rPr>
-                <w:rFonts w:asciiTheme="minorHAnsi" w:hAnsiTheme="minorHAnsi" w:cstheme="minorHAnsi"/>
-                <w:sz w:val="24"/>
-                <w:szCs w:val="24"/>
-              </w:rPr>
-            </w:pPr>
-            <w:r>
-              <w:rPr>
-                <w:rFonts w:asciiTheme="minorHAnsi" w:hAnsiTheme="minorHAnsi" w:cstheme="minorHAnsi"/>
-                <w:sz w:val="24"/>
-                <w:szCs w:val="24"/>
+                <w:sz w:val="20"/>
+                <w:szCs w:val="20"/>
+              </w:rPr>
+            </w:pPr>
+            <w:r>
+              <w:rPr>
+                <w:sz w:val="20"/>
+                <w:szCs w:val="20"/>
               </w:rPr>
               <w:t>Check tab</w:t>
             </w:r>
@@ -4460,9 +3840,8 @@
     <w:p>
       <w:pPr>
         <w:rPr>
-          <w:rFonts w:asciiTheme="minorHAnsi" w:hAnsiTheme="minorHAnsi" w:cstheme="minorHAnsi"/>
-          <w:sz w:val="24"/>
-          <w:szCs w:val="24"/>
+          <w:sz w:val="20"/>
+          <w:szCs w:val="20"/>
         </w:rPr>
       </w:pPr>
     </w:p>

</xml_diff>